<commit_message>
Kész projekt alapító dokumentum (PAD)
Co-Authored-By: Claude Sonnet 5.5 <noreply@anthropic.com>
Claude-Session: https://claude.ai/code/session_01Votz75dLaDY1wx33JY26GU
</commit_message>
<xml_diff>
--- a/dokumentumok/projekt_alapito_dokumentum.docx
+++ b/dokumentumok/projekt_alapito_dokumentum.docx
@@ -27,7 +27,7 @@
           <w:szCs w:val="40"/>
           <w14:ligatures w14:val="none"/>
         </w:rPr>
-        <w:t>„FixPont Mobilszerviz – digitális arculat és működési dokumentáció”</w:t>
+        <w:t>FixPont Mobilszerviz–digitális arculat és működési dokumentáció</w:t>
       </w:r>
     </w:p>
     <w:p>
@@ -56,7 +56,7 @@
           <w:lang w:val="en-US"/>
           <w14:ligatures w14:val="none"/>
         </w:rPr>
-        <w:t>Központi téma: mobiltelefon-szerviz mikrovállalkozás</w:t>
+        <w:t>M</w:t>
       </w:r>
       <w:r>
         <w:rPr>
@@ -67,82 +67,7 @@
           <w:lang w:val="en-US"/>
           <w14:ligatures w14:val="none"/>
         </w:rPr>
-      </w:r>
-      <w:r>
-        <w:rPr>
-          <w:rFonts w:ascii="Verdana" w:eastAsia="Times New Roman" w:hAnsi="Verdana" w:cs="Times New Roman"/>
-          <w:kern w:val="0"/>
-          <w:sz w:val="40"/>
-          <w:szCs w:val="40"/>
-          <w:lang w:val="en-US"/>
-          <w14:ligatures w14:val="none"/>
-        </w:rPr>
-      </w:r>
-      <w:proofErr w:type="spellStart"/>
-      <w:r>
-        <w:rPr>
-          <w:rFonts w:ascii="Verdana" w:eastAsia="Times New Roman" w:hAnsi="Verdana" w:cs="Times New Roman"/>
-          <w:kern w:val="0"/>
-          <w:sz w:val="40"/>
-          <w:szCs w:val="40"/>
-          <w:lang w:val="en-US"/>
-          <w14:ligatures w14:val="none"/>
-        </w:rPr>
-      </w:r>
-      <w:proofErr w:type="spellEnd"/>
-      <w:r>
-        <w:rPr>
-          <w:rFonts w:ascii="Verdana" w:eastAsia="Times New Roman" w:hAnsi="Verdana" w:cs="Times New Roman"/>
-          <w:kern w:val="0"/>
-          <w:sz w:val="40"/>
-          <w:szCs w:val="40"/>
-          <w:lang w:val="en-US"/>
-          <w14:ligatures w14:val="none"/>
-        </w:rPr>
-      </w:r>
-      <w:proofErr w:type="spellStart"/>
-      <w:r>
-        <w:rPr>
-          <w:rFonts w:ascii="Verdana" w:eastAsia="Times New Roman" w:hAnsi="Verdana" w:cs="Times New Roman"/>
-          <w:kern w:val="0"/>
-          <w:sz w:val="40"/>
-          <w:szCs w:val="40"/>
-          <w:lang w:val="en-US"/>
-          <w14:ligatures w14:val="none"/>
-        </w:rPr>
-      </w:r>
-      <w:proofErr w:type="spellEnd"/>
-      <w:r>
-        <w:rPr>
-          <w:rFonts w:ascii="Verdana" w:eastAsia="Times New Roman" w:hAnsi="Verdana" w:cs="Times New Roman"/>
-          <w:kern w:val="0"/>
-          <w:sz w:val="40"/>
-          <w:szCs w:val="40"/>
-          <w:lang w:val="en-US"/>
-          <w14:ligatures w14:val="none"/>
-        </w:rPr>
-      </w:r>
-      <w:proofErr w:type="spellStart"/>
-      <w:r>
-        <w:rPr>
-          <w:rFonts w:ascii="Verdana" w:eastAsia="Times New Roman" w:hAnsi="Verdana" w:cs="Times New Roman"/>
-          <w:kern w:val="0"/>
-          <w:sz w:val="40"/>
-          <w:szCs w:val="40"/>
-          <w:lang w:val="en-US"/>
-          <w14:ligatures w14:val="none"/>
-        </w:rPr>
-      </w:r>
-      <w:proofErr w:type="spellEnd"/>
-      <w:r>
-        <w:rPr>
-          <w:rFonts w:ascii="Verdana" w:eastAsia="Times New Roman" w:hAnsi="Verdana" w:cs="Times New Roman"/>
-          <w:kern w:val="0"/>
-          <w:sz w:val="40"/>
-          <w:szCs w:val="40"/>
-          <w:lang w:val="en-US"/>
-          <w14:ligatures w14:val="none"/>
-        </w:rPr>
+        <w:t>obiltelefon-szerviz mikrovállalkozás</w:t>
       </w:r>
     </w:p>
     <w:p>
@@ -213,33 +138,8 @@
           <w:kern w:val="0"/>
           <w:szCs w:val="24"/>
           <w14:ligatures w14:val="none"/>
-          <w:highlight w:val="yellow"/>
-        </w:rPr>
-        <w:t>[projektvezető neve]</w:t>
-      </w:r>
-      <w:r>
-        <w:rPr>
-          <w:rFonts w:ascii="Verdana" w:eastAsia="Times New Roman" w:hAnsi="Verdana" w:cs="Times New Roman"/>
-          <w:kern w:val="0"/>
-          <w:szCs w:val="24"/>
-          <w14:ligatures w14:val="none"/>
-        </w:rPr>
-      </w:r>
-      <w:r>
-        <w:rPr>
-          <w:rFonts w:ascii="Verdana" w:eastAsia="Times New Roman" w:hAnsi="Verdana" w:cs="Times New Roman"/>
-          <w:kern w:val="0"/>
-          <w:szCs w:val="24"/>
-          <w14:ligatures w14:val="none"/>
-        </w:rPr>
-      </w:r>
-      <w:r>
-        <w:rPr>
-          <w:rFonts w:ascii="Verdana" w:eastAsia="Times New Roman" w:hAnsi="Verdana" w:cs="Times New Roman"/>
-          <w:kern w:val="0"/>
-          <w:szCs w:val="24"/>
-          <w14:ligatures w14:val="none"/>
-        </w:rPr>
+        </w:rPr>
+        <w:t>Riskó Bence Zsolt</w:t>
       </w:r>
     </w:p>
     <w:p>
@@ -282,17 +182,8 @@
           <w:kern w:val="0"/>
           <w:szCs w:val="24"/>
           <w14:ligatures w14:val="none"/>
-          <w:highlight w:val="yellow"/>
-        </w:rPr>
-        <w:t>[a készítés dátuma]</w:t>
-      </w:r>
-      <w:r>
-        <w:rPr>
-          <w:rFonts w:ascii="Verdana" w:eastAsia="Times New Roman" w:hAnsi="Verdana" w:cs="Times New Roman"/>
-          <w:kern w:val="0"/>
-          <w:szCs w:val="24"/>
-          <w14:ligatures w14:val="none"/>
-        </w:rPr>
+        </w:rPr>
+        <w:t>2026.10.24</w:t>
       </w:r>
     </w:p>
     <w:p>
@@ -364,7 +255,7 @@
               <w:rFonts w:ascii="Cambria" w:eastAsia="Times New Roman" w:hAnsi="Cambria" w:cs="Times New Roman"/>
               <w:b/>
               <w:bCs/>
-              <w:color w:val="365F91"/>
+              <w:color w:val="000000" w:themeColor="text1"/>
               <w:kern w:val="0"/>
               <w:sz w:val="28"/>
               <w:szCs w:val="28"/>
@@ -377,7 +268,7 @@
               <w:rFonts w:ascii="Cambria" w:eastAsia="Times New Roman" w:hAnsi="Cambria" w:cs="Times New Roman"/>
               <w:b/>
               <w:bCs/>
-              <w:color w:val="365F91"/>
+              <w:color w:val="000000" w:themeColor="text1"/>
               <w:kern w:val="0"/>
               <w:sz w:val="28"/>
               <w:szCs w:val="28"/>
@@ -430,7 +321,7 @@
             </w:rPr>
             <w:fldChar w:fldCharType="separate"/>
           </w:r>
-          <w:hyperlink w:anchor="_Toc241227784" w:history="1">
+          <w:hyperlink w:anchor="_Toc243747027" w:history="1">
             <w:r>
               <w:rPr>
                 <w:rStyle w:val="Hiperhivatkozs"/>
@@ -462,7 +353,7 @@
                 <w:noProof/>
                 <w:webHidden/>
               </w:rPr>
-              <w:instrText xml:space="preserve"> PAGEREF _Toc241227784 \h </w:instrText>
+              <w:instrText xml:space="preserve"> PAGEREF _Toc243747027 \h </w:instrText>
             </w:r>
             <w:r>
               <w:rPr>
@@ -506,7 +397,7 @@
               <w:lang w:eastAsia="hu-HU"/>
             </w:rPr>
           </w:pPr>
-          <w:hyperlink w:anchor="_Toc241227785" w:history="1">
+          <w:hyperlink w:anchor="_Toc243747028" w:history="1">
             <w:r>
               <w:rPr>
                 <w:rStyle w:val="Hiperhivatkozs"/>
@@ -540,7 +431,7 @@
                 <w:noProof/>
                 <w:webHidden/>
               </w:rPr>
-              <w:instrText xml:space="preserve"> PAGEREF _Toc241227785 \h </w:instrText>
+              <w:instrText xml:space="preserve"> PAGEREF _Toc243747028 \h </w:instrText>
             </w:r>
             <w:r>
               <w:rPr>
@@ -584,7 +475,7 @@
               <w:lang w:eastAsia="hu-HU"/>
             </w:rPr>
           </w:pPr>
-          <w:hyperlink w:anchor="_Toc241227786" w:history="1">
+          <w:hyperlink w:anchor="_Toc243747029" w:history="1">
             <w:r>
               <w:rPr>
                 <w:rStyle w:val="Hiperhivatkozs"/>
@@ -618,7 +509,7 @@
                 <w:noProof/>
                 <w:webHidden/>
               </w:rPr>
-              <w:instrText xml:space="preserve"> PAGEREF _Toc241227786 \h </w:instrText>
+              <w:instrText xml:space="preserve"> PAGEREF _Toc243747029 \h </w:instrText>
             </w:r>
             <w:r>
               <w:rPr>
@@ -662,7 +553,7 @@
               <w:lang w:eastAsia="hu-HU"/>
             </w:rPr>
           </w:pPr>
-          <w:hyperlink w:anchor="_Toc241227787" w:history="1">
+          <w:hyperlink w:anchor="_Toc243747030" w:history="1">
             <w:r>
               <w:rPr>
                 <w:rStyle w:val="Hiperhivatkozs"/>
@@ -696,7 +587,7 @@
                 <w:noProof/>
                 <w:webHidden/>
               </w:rPr>
-              <w:instrText xml:space="preserve"> PAGEREF _Toc241227787 \h </w:instrText>
+              <w:instrText xml:space="preserve"> PAGEREF _Toc243747030 \h </w:instrText>
             </w:r>
             <w:r>
               <w:rPr>
@@ -716,7 +607,7 @@
                 <w:noProof/>
                 <w:webHidden/>
               </w:rPr>
-              <w:t>3</w:t>
+              <w:t>4</w:t>
             </w:r>
             <w:r>
               <w:rPr>
@@ -740,7 +631,7 @@
               <w:lang w:eastAsia="hu-HU"/>
             </w:rPr>
           </w:pPr>
-          <w:hyperlink w:anchor="_Toc241227788" w:history="1">
+          <w:hyperlink w:anchor="_Toc243747031" w:history="1">
             <w:r>
               <w:rPr>
                 <w:rStyle w:val="Hiperhivatkozs"/>
@@ -774,7 +665,7 @@
                 <w:noProof/>
                 <w:webHidden/>
               </w:rPr>
-              <w:instrText xml:space="preserve"> PAGEREF _Toc241227788 \h </w:instrText>
+              <w:instrText xml:space="preserve"> PAGEREF _Toc243747031 \h </w:instrText>
             </w:r>
             <w:r>
               <w:rPr>
@@ -794,7 +685,7 @@
                 <w:noProof/>
                 <w:webHidden/>
               </w:rPr>
-              <w:t>3</w:t>
+              <w:t>4</w:t>
             </w:r>
             <w:r>
               <w:rPr>
@@ -818,7 +709,7 @@
               <w:lang w:eastAsia="hu-HU"/>
             </w:rPr>
           </w:pPr>
-          <w:hyperlink w:anchor="_Toc241227789" w:history="1">
+          <w:hyperlink w:anchor="_Toc243747032" w:history="1">
             <w:r>
               <w:rPr>
                 <w:rStyle w:val="Hiperhivatkozs"/>
@@ -852,7 +743,7 @@
                 <w:noProof/>
                 <w:webHidden/>
               </w:rPr>
-              <w:instrText xml:space="preserve"> PAGEREF _Toc241227789 \h </w:instrText>
+              <w:instrText xml:space="preserve"> PAGEREF _Toc243747032 \h </w:instrText>
             </w:r>
             <w:r>
               <w:rPr>
@@ -872,251 +763,7 @@
                 <w:noProof/>
                 <w:webHidden/>
               </w:rPr>
-              <w:t>4</w:t>
-            </w:r>
-            <w:r>
-              <w:rPr>
-                <w:noProof/>
-                <w:webHidden/>
-              </w:rPr>
-              <w:fldChar w:fldCharType="end"/>
-            </w:r>
-          </w:hyperlink>
-        </w:p>
-        <w:p>
-          <w:pPr>
-            <w:pStyle w:val="TJ1"/>
-            <w:tabs>
-              <w:tab w:val="right" w:leader="dot" w:pos="8303"/>
-            </w:tabs>
-            <w:rPr>
-              <w:rFonts w:asciiTheme="minorHAnsi" w:eastAsiaTheme="minorEastAsia" w:hAnsiTheme="minorHAnsi"/>
-              <w:noProof/>
-              <w:szCs w:val="24"/>
-              <w:lang w:eastAsia="hu-HU"/>
-            </w:rPr>
-          </w:pPr>
-          <w:hyperlink w:anchor="_Toc241227790" w:history="1">
-            <w:r>
-              <w:rPr>
-                <w:rStyle w:val="Hiperhivatkozs"/>
-                <w:rFonts w:ascii="Verdana" w:eastAsia="Times New Roman" w:hAnsi="Verdana" w:cs="Arial"/>
-                <w:b/>
-                <w:bCs/>
-                <w:noProof/>
-                <w:kern w:val="32"/>
-                <w14:ligatures w14:val="none"/>
-              </w:rPr>
-              <w:t>Mellékletek</w:t>
-            </w:r>
-            <w:r>
-              <w:rPr>
-                <w:noProof/>
-                <w:webHidden/>
-              </w:rPr>
-              <w:tab/>
-            </w:r>
-            <w:r>
-              <w:rPr>
-                <w:noProof/>
-                <w:webHidden/>
-              </w:rPr>
-              <w:fldChar w:fldCharType="begin"/>
-            </w:r>
-            <w:r>
-              <w:rPr>
-                <w:noProof/>
-                <w:webHidden/>
-              </w:rPr>
-              <w:instrText xml:space="preserve"> PAGEREF _Toc241227790 \h </w:instrText>
-            </w:r>
-            <w:r>
-              <w:rPr>
-                <w:noProof/>
-                <w:webHidden/>
-              </w:rPr>
-            </w:r>
-            <w:r>
-              <w:rPr>
-                <w:noProof/>
-                <w:webHidden/>
-              </w:rPr>
-              <w:fldChar w:fldCharType="separate"/>
-            </w:r>
-            <w:r>
-              <w:rPr>
-                <w:noProof/>
-                <w:webHidden/>
-              </w:rPr>
               <w:t>5</w:t>
-            </w:r>
-            <w:r>
-              <w:rPr>
-                <w:noProof/>
-                <w:webHidden/>
-              </w:rPr>
-              <w:fldChar w:fldCharType="end"/>
-            </w:r>
-          </w:hyperlink>
-        </w:p>
-        <w:p>
-          <w:pPr>
-            <w:pStyle w:val="TJ2"/>
-            <w:tabs>
-              <w:tab w:val="right" w:leader="dot" w:pos="8303"/>
-            </w:tabs>
-            <w:rPr>
-              <w:rFonts w:asciiTheme="minorHAnsi" w:eastAsiaTheme="minorEastAsia" w:hAnsiTheme="minorHAnsi"/>
-              <w:noProof/>
-              <w:szCs w:val="24"/>
-              <w:lang w:eastAsia="hu-HU"/>
-            </w:rPr>
-          </w:pPr>
-          <w:hyperlink w:anchor="_Toc241227791" w:history="1">
-            <w:r>
-              <w:rPr>
-                <w:rStyle w:val="Hiperhivatkozs"/>
-                <w:rFonts w:ascii="Verdana" w:eastAsia="Times New Roman" w:hAnsi="Verdana" w:cs="Arial"/>
-                <w:b/>
-                <w:bCs/>
-                <w:i/>
-                <w:iCs/>
-                <w:noProof/>
-                <w:kern w:val="0"/>
-                <w14:ligatures w14:val="none"/>
-              </w:rPr>
-              <w:t>Projekt ütemezése</w:t>
-            </w:r>
-            <w:r>
-              <w:rPr>
-                <w:noProof/>
-                <w:webHidden/>
-              </w:rPr>
-              <w:tab/>
-            </w:r>
-            <w:r>
-              <w:rPr>
-                <w:noProof/>
-                <w:webHidden/>
-              </w:rPr>
-              <w:fldChar w:fldCharType="begin"/>
-            </w:r>
-            <w:r>
-              <w:rPr>
-                <w:noProof/>
-                <w:webHidden/>
-              </w:rPr>
-              <w:instrText xml:space="preserve"> PAGEREF _Toc241227791 \h </w:instrText>
-            </w:r>
-            <w:r>
-              <w:rPr>
-                <w:noProof/>
-                <w:webHidden/>
-              </w:rPr>
-            </w:r>
-            <w:r>
-              <w:rPr>
-                <w:noProof/>
-                <w:webHidden/>
-              </w:rPr>
-              <w:fldChar w:fldCharType="separate"/>
-            </w:r>
-            <w:r>
-              <w:rPr>
-                <w:noProof/>
-                <w:webHidden/>
-              </w:rPr>
-              <w:t>5</w:t>
-            </w:r>
-            <w:r>
-              <w:rPr>
-                <w:noProof/>
-                <w:webHidden/>
-              </w:rPr>
-              <w:fldChar w:fldCharType="end"/>
-            </w:r>
-          </w:hyperlink>
-        </w:p>
-        <w:p>
-          <w:pPr>
-            <w:pStyle w:val="TJ2"/>
-            <w:tabs>
-              <w:tab w:val="right" w:leader="dot" w:pos="8303"/>
-            </w:tabs>
-            <w:rPr>
-              <w:rFonts w:asciiTheme="minorHAnsi" w:eastAsiaTheme="minorEastAsia" w:hAnsiTheme="minorHAnsi"/>
-              <w:noProof/>
-              <w:szCs w:val="24"/>
-              <w:lang w:eastAsia="hu-HU"/>
-            </w:rPr>
-          </w:pPr>
-          <w:hyperlink w:anchor="_Toc241227792" w:history="1">
-            <w:r>
-              <w:rPr>
-                <w:rStyle w:val="Hiperhivatkozs"/>
-                <w:rFonts w:ascii="Verdana" w:eastAsia="Times New Roman" w:hAnsi="Verdana" w:cs="Arial"/>
-                <w:b/>
-                <w:bCs/>
-                <w:i/>
-                <w:iCs/>
-                <w:noProof/>
-                <w:kern w:val="0"/>
-                <w14:ligatures w14:val="none"/>
-              </w:rPr>
-              <w:t xml:space="preserve">Emlékeztető minta </w:t>
-            </w:r>
-            <w:r>
-              <w:rPr>
-                <w:rStyle w:val="Hiperhivatkozs"/>
-                <w:rFonts w:ascii="Verdana" w:eastAsia="Times New Roman" w:hAnsi="Verdana" w:cs="Arial"/>
-                <w:i/>
-                <w:iCs/>
-                <w:noProof/>
-                <w:kern w:val="0"/>
-                <w14:ligatures w14:val="none"/>
-              </w:rPr>
-              <w:t>(opcionális)</w:t>
-            </w:r>
-            <w:r>
-              <w:rPr>
-                <w:noProof/>
-                <w:webHidden/>
-              </w:rPr>
-              <w:tab/>
-            </w:r>
-            <w:r>
-              <w:rPr>
-                <w:noProof/>
-                <w:webHidden/>
-              </w:rPr>
-              <w:fldChar w:fldCharType="begin"/>
-            </w:r>
-            <w:r>
-              <w:rPr>
-                <w:noProof/>
-                <w:webHidden/>
-              </w:rPr>
-              <w:instrText xml:space="preserve"> PAGEREF _Toc241227792 \h </w:instrText>
-            </w:r>
-            <w:r>
-              <w:rPr>
-                <w:noProof/>
-                <w:webHidden/>
-              </w:rPr>
-            </w:r>
-            <w:r>
-              <w:rPr>
-                <w:noProof/>
-                <w:webHidden/>
-              </w:rPr>
-              <w:fldChar w:fldCharType="separate"/>
-            </w:r>
-            <w:r>
-              <w:rPr>
-                <w:noProof/>
-                <w:webHidden/>
-              </w:rPr>
-              <w:t>6</w:t>
             </w:r>
             <w:r>
               <w:rPr>
@@ -1155,17 +802,6 @@
     </w:sdt>
     <w:p>
       <w:pPr>
-        <w:spacing w:after="200" w:line="276" w:lineRule="auto"/>
-        <w:rPr>
-          <w:rFonts w:ascii="Verdana" w:eastAsia="Times New Roman" w:hAnsi="Verdana" w:cs="Times New Roman"/>
-          <w:kern w:val="0"/>
-          <w:szCs w:val="24"/>
-          <w14:ligatures w14:val="none"/>
-        </w:rPr>
-      </w:pPr>
-    </w:p>
-    <w:p>
-      <w:pPr>
         <w:keepNext/>
         <w:pageBreakBefore/>
         <w:tabs>
@@ -1186,7 +822,7 @@
       </w:pPr>
       <w:bookmarkStart w:id="0" w:name="_Ref109033540"/>
       <w:bookmarkStart w:id="1" w:name="_Toc236207468"/>
-      <w:bookmarkStart w:id="2" w:name="_Toc241227784"/>
+      <w:bookmarkStart w:id="2" w:name="_Toc243747027"/>
       <w:r>
         <w:rPr>
           <w:rFonts w:ascii="Verdana" w:eastAsia="Times New Roman" w:hAnsi="Verdana" w:cs="Arial"/>
@@ -1230,7 +866,7 @@
         </w:rPr>
       </w:pPr>
       <w:bookmarkStart w:id="3" w:name="_Toc236207470"/>
-      <w:bookmarkStart w:id="4" w:name="_Toc241227785"/>
+      <w:bookmarkStart w:id="4" w:name="_Toc243747028"/>
       <w:r>
         <w:rPr>
           <w:rFonts w:ascii="Verdana" w:eastAsia="Times New Roman" w:hAnsi="Verdana" w:cs="Arial"/>
@@ -1268,26 +904,7 @@
           <w:lang w:eastAsia="hu-HU"/>
           <w14:ligatures w14:val="none"/>
         </w:rPr>
-        <w:t>A projekt neve: „FixPont Mobilszerviz – digitális arculat és működési dokumentáció”</w:t>
-      </w:r>
-      <w:r>
-        <w:rPr>
-          <w:rFonts w:ascii="Verdana" w:eastAsia="Times New Roman" w:hAnsi="Verdana" w:cs="Times New Roman"/>
-          <w:i/>
-          <w:kern w:val="0"/>
-          <w:szCs w:val="20"/>
-          <w:lang w:eastAsia="hu-HU"/>
-          <w14:ligatures w14:val="none"/>
-        </w:rPr>
-      </w:r>
-      <w:r>
-        <w:rPr>
-          <w:rFonts w:ascii="Verdana" w:eastAsia="Times New Roman" w:hAnsi="Verdana" w:cs="Times New Roman"/>
-          <w:kern w:val="0"/>
-          <w:szCs w:val="20"/>
-          <w:lang w:eastAsia="hu-HU"/>
-          <w14:ligatures w14:val="none"/>
-        </w:rPr>
+        <w:t>A projekt neve: FixPont Mobilszerviz–digitális arculat és működési dokumentáció</w:t>
       </w:r>
     </w:p>
     <w:p>
@@ -1317,11 +934,10 @@
           <w:rFonts w:ascii="Verdana" w:eastAsia="Times New Roman" w:hAnsi="Verdana" w:cs="Times New Roman"/>
           <w:kern w:val="0"/>
           <w:szCs w:val="20"/>
-          <w:highlight w:val="yellow"/>
-          <w:lang w:eastAsia="hu-HU"/>
-          <w14:ligatures w14:val="none"/>
-        </w:rPr>
-        <w:t>[tervezett kezdés dátuma]</w:t>
+          <w:lang w:eastAsia="hu-HU"/>
+          <w14:ligatures w14:val="none"/>
+        </w:rPr>
+        <w:t>2026.10.12.</w:t>
       </w:r>
     </w:p>
     <w:p>
@@ -1351,11 +967,10 @@
           <w:rFonts w:ascii="Verdana" w:eastAsia="Times New Roman" w:hAnsi="Verdana" w:cs="Times New Roman"/>
           <w:kern w:val="0"/>
           <w:szCs w:val="20"/>
-          <w:highlight w:val="yellow"/>
-          <w:lang w:eastAsia="hu-HU"/>
-          <w14:ligatures w14:val="none"/>
-        </w:rPr>
-        <w:t>[tervezett befejezés dátuma]</w:t>
+          <w:lang w:eastAsia="hu-HU"/>
+          <w14:ligatures w14:val="none"/>
+        </w:rPr>
+        <w:t>2026.10.24</w:t>
       </w:r>
     </w:p>
     <w:p>
@@ -1387,7 +1002,7 @@
       <w:bookmarkStart w:id="6" w:name="_Ref109033532"/>
       <w:bookmarkStart w:id="7" w:name="_Ref109033580"/>
       <w:bookmarkStart w:id="8" w:name="_Toc236207471"/>
-      <w:bookmarkStart w:id="9" w:name="_Toc241227786"/>
+      <w:bookmarkStart w:id="9" w:name="_Toc243747029"/>
       <w:r>
         <w:rPr>
           <w:rFonts w:ascii="Verdana" w:eastAsia="Times New Roman" w:hAnsi="Verdana" w:cs="Arial"/>
@@ -1449,11 +1064,10 @@
           <w:rFonts w:ascii="Verdana" w:eastAsia="Times New Roman" w:hAnsi="Verdana" w:cs="Times New Roman"/>
           <w:kern w:val="0"/>
           <w:szCs w:val="20"/>
-          <w:highlight w:val="yellow"/>
-          <w:lang w:eastAsia="hu-HU"/>
-          <w14:ligatures w14:val="none"/>
-        </w:rPr>
-        <w:t>[csapatnév]</w:t>
+          <w:lang w:eastAsia="hu-HU"/>
+          <w14:ligatures w14:val="none"/>
+        </w:rPr>
+        <w:t>FIXPONT IT</w:t>
       </w:r>
       <w:r>
         <w:rPr>
@@ -1464,24 +1078,6 @@
           <w14:ligatures w14:val="none"/>
         </w:rPr>
         <w:t xml:space="preserve"> csapat a projekt végrehajtásával az alábbi célokat kívánja elérni:</w:t>
-      </w:r>
-      <w:r>
-        <w:rPr>
-          <w:rFonts w:ascii="Verdana" w:eastAsia="Times New Roman" w:hAnsi="Verdana" w:cs="Times New Roman"/>
-          <w:kern w:val="0"/>
-          <w:szCs w:val="20"/>
-          <w:lang w:eastAsia="hu-HU"/>
-          <w14:ligatures w14:val="none"/>
-        </w:rPr>
-      </w:r>
-      <w:r>
-        <w:rPr>
-          <w:rFonts w:ascii="Verdana" w:eastAsia="Times New Roman" w:hAnsi="Verdana" w:cs="Times New Roman"/>
-          <w:kern w:val="0"/>
-          <w:szCs w:val="20"/>
-          <w:lang w:eastAsia="hu-HU"/>
-          <w14:ligatures w14:val="none"/>
-        </w:rPr>
       </w:r>
     </w:p>
     <w:p>
@@ -1508,7 +1104,7 @@
           <w:lang w:eastAsia="hu-HU"/>
           <w14:ligatures w14:val="none"/>
         </w:rPr>
-        <w:t>Egy kitalált mobiltelefon-szerviz mikrovállalkozás (FixPont Mobilszerviz) teljes digitális arculatának és működési dokumentációjának elkészítése.</w:t>
+        <w:t>FixPont Mobilszerviz teljes digitális arculatának és működési dokumentációjának elkészítése.</w:t>
       </w:r>
     </w:p>
     <w:p>
@@ -1535,7 +1131,27 @@
           <w:lang w:eastAsia="hu-HU"/>
           <w14:ligatures w14:val="none"/>
         </w:rPr>
-        <w:t>Cégbemutató dokumentum készítése Word szövegszerkesztővel (1. rész): 8–12 oldal, tartalomjegyzékkel, címsorstílusokkal, élőfejjel, élőlábbal, képjegyzékkel, lábjegyzettel és forráslistával.</w:t>
+        <w:t>Cégbemutató</w:t>
+      </w:r>
+      <w:r>
+        <w:rPr>
+          <w:rFonts w:ascii="Verdana" w:eastAsia="Times New Roman" w:hAnsi="Verdana" w:cs="Times New Roman"/>
+          <w:kern w:val="0"/>
+          <w:szCs w:val="20"/>
+          <w:lang w:eastAsia="hu-HU"/>
+          <w14:ligatures w14:val="none"/>
+        </w:rPr>
+        <w:t xml:space="preserve"> </w:t>
+      </w:r>
+      <w:r>
+        <w:rPr>
+          <w:rFonts w:ascii="Verdana" w:eastAsia="Times New Roman" w:hAnsi="Verdana" w:cs="Times New Roman"/>
+          <w:kern w:val="0"/>
+          <w:szCs w:val="20"/>
+          <w:lang w:eastAsia="hu-HU"/>
+          <w14:ligatures w14:val="none"/>
+        </w:rPr>
+        <w:t>dokumentum készítése Word szövegszerkesztővel: 8–12 oldal, tartalomjegyzékkel, címsorstílusokkal, élőfejjel, élőlábbal, képjegyzékkel, lábjegyzettel és forráslistával.</w:t>
       </w:r>
     </w:p>
     <w:p>
@@ -1562,7 +1178,7 @@
           <w:lang w:eastAsia="hu-HU"/>
           <w14:ligatures w14:val="none"/>
         </w:rPr>
-        <w:t>Forgalmi Excel munkafüzet készítése (2. rész): 12 hónap bevételi és kiadási adata, Adatok és Összesítés munkalap, legalább 5 beépített függvény (SZUM, ÁTLAG, HA, MAX, DARABTELI), oszlop- és tortadiagram.</w:t>
+        <w:t>Forgalmi Excel munkafüzet készítése: 12 hónap bevételi és kiadási adata, Adatok és Összesítés munkalap, legalább 5 beépített függvény, oszlop- és tortadiagram.</w:t>
       </w:r>
     </w:p>
     <w:p>
@@ -1589,7 +1205,7 @@
           <w:lang w:eastAsia="hu-HU"/>
           <w14:ligatures w14:val="none"/>
         </w:rPr>
-        <w:t>Digitális tartalmak készítése (3. rész): egyoldalas promóciós weblap, 8–10 diás PowerPoint bemutató a 2. részből származó grafikonnal, valamint legalább 6 kérdéses online elégedettségi űrlap.</w:t>
+        <w:t>Digitális tartalmak készítése: egyoldalas promóciós weblap, 8–10 diás PowerPoint bemutató a 2. részből származó grafikonnal, valamint legalább 6 kérdéses online elégedettségi űrlap.</w:t>
       </w:r>
     </w:p>
     <w:p>
@@ -1616,7 +1232,7 @@
           <w:lang w:eastAsia="hu-HU"/>
           <w14:ligatures w14:val="none"/>
         </w:rPr>
-        <w:t>A munkarészek egymásra épülő, egységes (azonos vállalkozásra és arculatra épülő) elkészítése, minden dokumentum elérhetősége a weblapról.</w:t>
+        <w:t>A munkarészek egymásra épülő, egységes elkészítése, minden dokumentum elérhetősége a weblapról.</w:t>
       </w:r>
     </w:p>
     <w:p>
@@ -1639,7 +1255,7 @@
           <w:lang w:eastAsia="hu-HU"/>
           <w14:ligatures w14:val="none"/>
         </w:rPr>
-        <w:t>A választott témakör a paramétertábla alapján: mobiltelefon-szerviz. A feladat egy mikrovállalkozás digitális arculatának és működési dokumentációjának elkészítése három, egymásra épülő munkarészben. A vállalkozás a FixPont Mobilszerviz, amely kijelző-, akkumulátor- és töltőcsatlakozó-cserével, vízkár-kezeléssel és szoftveres hibaelhárítással foglalkozik, fix áron és 6 hónap garanciával. A feladat meghatározásához készített számítás (a forgalmi munkafüzet kitalált adatai alapján): éves bevétel 18 420 000 Ft, éves kiadás 14 000 000 Ft, így az éves eredmény 4 420 000 Ft (a bevétel kb. 24%-a); az átlagos havi bevétel kb. 1 535 000 Ft, a legerősebb hónap a december (2 050 000 Ft). A kiadások megoszlása: alkatrészek 40%, bérek és járulékok kb. 34%, bérleti díj kb. 14%, rezsi kb. 4%, marketing kb. 3%, egyéb kb. 5%.</w:t>
+        <w:t>A választott témakör a paramétertábla alapján: mobiltelefon-szerviz. A feladat egy mikrovállalkozás digitális arculatának és működési dokumentációjának elkészítése három, egymásra épülő munkarészben. A vállalkozás a FixPont Mobilszerviz, amely kijelző-, akkumulátor- és töltőcsatlakozó-cserével, vízkár-kezeléssel és szoftveres hibaelhárítással foglalkozik, fix áron és 6 hónap garanciával. A feladat meghatározásához készített számítá</w:t>
       </w:r>
       <w:r>
         <w:rPr>
@@ -1649,6 +1265,7 @@
           <w:lang w:eastAsia="hu-HU"/>
           <w14:ligatures w14:val="none"/>
         </w:rPr>
+        <w:t>s</w:t>
       </w:r>
       <w:r>
         <w:rPr>
@@ -1658,6 +1275,7 @@
           <w:lang w:eastAsia="hu-HU"/>
           <w14:ligatures w14:val="none"/>
         </w:rPr>
+        <w:t xml:space="preserve">: éves bevétel 18 420 000 Ft, éves kiadás 14 000 000 Ft, így az éves eredmény 4 420 000 Ft (a bevétel kb. 24%-a); az átlagos havi bevétel kb. 1 535 000 Ft, a legerősebb hónap a december (2 050 000 </w:t>
       </w:r>
       <w:r>
         <w:rPr>
@@ -1667,51 +1285,8 @@
           <w:lang w:eastAsia="hu-HU"/>
           <w14:ligatures w14:val="none"/>
         </w:rPr>
-      </w:r>
-      <w:r>
-        <w:rPr>
-          <w:rFonts w:ascii="Verdana" w:eastAsia="Times New Roman" w:hAnsi="Verdana" w:cs="Times New Roman"/>
-          <w:kern w:val="0"/>
-          <w:szCs w:val="20"/>
-          <w:lang w:eastAsia="hu-HU"/>
-          <w14:ligatures w14:val="none"/>
-        </w:rPr>
-      </w:r>
-      <w:r>
-        <w:rPr>
-          <w:rFonts w:ascii="Verdana" w:eastAsia="Times New Roman" w:hAnsi="Verdana" w:cs="Times New Roman"/>
-          <w:kern w:val="0"/>
-          <w:szCs w:val="20"/>
-          <w:lang w:eastAsia="hu-HU"/>
-          <w14:ligatures w14:val="none"/>
-        </w:rPr>
-      </w:r>
-      <w:r>
-        <w:rPr>
-          <w:rFonts w:ascii="Verdana" w:eastAsia="Times New Roman" w:hAnsi="Verdana" w:cs="Times New Roman"/>
-          <w:kern w:val="0"/>
-          <w:szCs w:val="20"/>
-          <w:lang w:eastAsia="hu-HU"/>
-          <w14:ligatures w14:val="none"/>
-        </w:rPr>
-      </w:r>
-      <w:r>
-        <w:rPr>
-          <w:rFonts w:ascii="Verdana" w:eastAsia="Times New Roman" w:hAnsi="Verdana" w:cs="Times New Roman"/>
-          <w:kern w:val="0"/>
-          <w:szCs w:val="20"/>
-          <w:lang w:eastAsia="hu-HU"/>
-          <w14:ligatures w14:val="none"/>
-        </w:rPr>
-      </w:r>
-      <w:r>
-        <w:rPr>
-          <w:rFonts w:ascii="Verdana" w:eastAsia="Times New Roman" w:hAnsi="Verdana" w:cs="Times New Roman"/>
-          <w:kern w:val="0"/>
-          <w:szCs w:val="20"/>
-          <w:lang w:eastAsia="hu-HU"/>
-          <w14:ligatures w14:val="none"/>
-        </w:rPr>
+        <w:lastRenderedPageBreak/>
+        <w:t>Ft). A kiadások megoszlása: alkatrészek 40%, bérek és járulékok kb. 34%, bérleti díj kb. 14%, rezsi kb. 4%, marketing kb. 3%, egyéb kb. 5%.</w:t>
       </w:r>
     </w:p>
     <w:p>
@@ -1754,7 +1329,7 @@
         </w:rPr>
       </w:pPr>
       <w:bookmarkStart w:id="10" w:name="_Toc236207473"/>
-      <w:bookmarkStart w:id="11" w:name="_Toc241227787"/>
+      <w:bookmarkStart w:id="11" w:name="_Toc243747030"/>
       <w:r>
         <w:rPr>
           <w:rFonts w:ascii="Verdana" w:eastAsia="Times New Roman" w:hAnsi="Verdana" w:cs="Arial"/>
@@ -1823,175 +1398,7 @@
           <w:lang w:val="en-US"/>
           <w14:ligatures w14:val="none"/>
         </w:rPr>
-        <w:t xml:space="preserve">A </w:t>
-      </w:r>
-      <w:proofErr w:type="spellStart"/>
-      <w:r>
-        <w:rPr>
-          <w:rFonts w:ascii="Verdana" w:eastAsia="Times New Roman" w:hAnsi="Verdana" w:cs="Times New Roman"/>
-          <w:bCs/>
-          <w:kern w:val="0"/>
-          <w:szCs w:val="24"/>
-          <w:lang w:val="en-US"/>
-          <w14:ligatures w14:val="none"/>
-        </w:rPr>
-        <w:t>projekt</w:t>
-      </w:r>
-      <w:proofErr w:type="spellEnd"/>
-      <w:r>
-        <w:rPr>
-          <w:rFonts w:ascii="Verdana" w:eastAsia="Times New Roman" w:hAnsi="Verdana" w:cs="Times New Roman"/>
-          <w:bCs/>
-          <w:kern w:val="0"/>
-          <w:szCs w:val="24"/>
-          <w:lang w:val="en-US"/>
-          <w14:ligatures w14:val="none"/>
-        </w:rPr>
-        <w:t xml:space="preserve"> </w:t>
-      </w:r>
-      <w:proofErr w:type="spellStart"/>
-      <w:r>
-        <w:rPr>
-          <w:rFonts w:ascii="Verdana" w:eastAsia="Times New Roman" w:hAnsi="Verdana" w:cs="Times New Roman"/>
-          <w:bCs/>
-          <w:kern w:val="0"/>
-          <w:szCs w:val="24"/>
-          <w:lang w:val="en-US"/>
-          <w14:ligatures w14:val="none"/>
-        </w:rPr>
-        <w:t>határidőre</w:t>
-      </w:r>
-      <w:proofErr w:type="spellEnd"/>
-      <w:r>
-        <w:rPr>
-          <w:rFonts w:ascii="Verdana" w:eastAsia="Times New Roman" w:hAnsi="Verdana" w:cs="Times New Roman"/>
-          <w:bCs/>
-          <w:kern w:val="0"/>
-          <w:szCs w:val="24"/>
-          <w:lang w:val="en-US"/>
-          <w14:ligatures w14:val="none"/>
-        </w:rPr>
-        <w:t xml:space="preserve">, </w:t>
-      </w:r>
-      <w:proofErr w:type="spellStart"/>
-      <w:r>
-        <w:rPr>
-          <w:rFonts w:ascii="Verdana" w:eastAsia="Times New Roman" w:hAnsi="Verdana" w:cs="Times New Roman"/>
-          <w:bCs/>
-          <w:kern w:val="0"/>
-          <w:szCs w:val="24"/>
-          <w:lang w:val="en-US"/>
-          <w14:ligatures w14:val="none"/>
-        </w:rPr>
-        <w:t>megfelelő</w:t>
-      </w:r>
-      <w:proofErr w:type="spellEnd"/>
-      <w:r>
-        <w:rPr>
-          <w:rFonts w:ascii="Verdana" w:eastAsia="Times New Roman" w:hAnsi="Verdana" w:cs="Times New Roman"/>
-          <w:bCs/>
-          <w:kern w:val="0"/>
-          <w:szCs w:val="24"/>
-          <w:lang w:val="en-US"/>
-          <w14:ligatures w14:val="none"/>
-        </w:rPr>
-        <w:t xml:space="preserve"> </w:t>
-      </w:r>
-      <w:proofErr w:type="spellStart"/>
-      <w:r>
-        <w:rPr>
-          <w:rFonts w:ascii="Verdana" w:eastAsia="Times New Roman" w:hAnsi="Verdana" w:cs="Times New Roman"/>
-          <w:bCs/>
-          <w:kern w:val="0"/>
-          <w:szCs w:val="24"/>
-          <w:lang w:val="en-US"/>
-          <w14:ligatures w14:val="none"/>
-        </w:rPr>
-        <w:t>minőségű</w:t>
-      </w:r>
-      <w:proofErr w:type="spellEnd"/>
-      <w:r>
-        <w:rPr>
-          <w:rFonts w:ascii="Verdana" w:eastAsia="Times New Roman" w:hAnsi="Verdana" w:cs="Times New Roman"/>
-          <w:bCs/>
-          <w:kern w:val="0"/>
-          <w:szCs w:val="24"/>
-          <w:lang w:val="en-US"/>
-          <w14:ligatures w14:val="none"/>
-        </w:rPr>
-        <w:t xml:space="preserve"> </w:t>
-      </w:r>
-      <w:proofErr w:type="spellStart"/>
-      <w:r>
-        <w:rPr>
-          <w:rFonts w:ascii="Verdana" w:eastAsia="Times New Roman" w:hAnsi="Verdana" w:cs="Times New Roman"/>
-          <w:bCs/>
-          <w:kern w:val="0"/>
-          <w:szCs w:val="24"/>
-          <w:lang w:val="en-US"/>
-          <w14:ligatures w14:val="none"/>
-        </w:rPr>
-        <w:t>végtermékek</w:t>
-      </w:r>
-      <w:proofErr w:type="spellEnd"/>
-      <w:r>
-        <w:rPr>
-          <w:rFonts w:ascii="Verdana" w:eastAsia="Times New Roman" w:hAnsi="Verdana" w:cs="Times New Roman"/>
-          <w:bCs/>
-          <w:kern w:val="0"/>
-          <w:szCs w:val="24"/>
-          <w:lang w:val="en-US"/>
-          <w14:ligatures w14:val="none"/>
-        </w:rPr>
-        <w:t xml:space="preserve"> </w:t>
-      </w:r>
-      <w:proofErr w:type="spellStart"/>
-      <w:r>
-        <w:rPr>
-          <w:rFonts w:ascii="Verdana" w:eastAsia="Times New Roman" w:hAnsi="Verdana" w:cs="Times New Roman"/>
-          <w:bCs/>
-          <w:kern w:val="0"/>
-          <w:szCs w:val="24"/>
-          <w:lang w:val="en-US"/>
-          <w14:ligatures w14:val="none"/>
-        </w:rPr>
-        <w:t>átadásával</w:t>
-      </w:r>
-      <w:proofErr w:type="spellEnd"/>
-      <w:r>
-        <w:rPr>
-          <w:rFonts w:ascii="Verdana" w:eastAsia="Times New Roman" w:hAnsi="Verdana" w:cs="Times New Roman"/>
-          <w:bCs/>
-          <w:kern w:val="0"/>
-          <w:szCs w:val="24"/>
-          <w:lang w:val="en-US"/>
-          <w14:ligatures w14:val="none"/>
-        </w:rPr>
-        <w:t xml:space="preserve"> </w:t>
-      </w:r>
-      <w:proofErr w:type="spellStart"/>
-      <w:r>
-        <w:rPr>
-          <w:rFonts w:ascii="Verdana" w:eastAsia="Times New Roman" w:hAnsi="Verdana" w:cs="Times New Roman"/>
-          <w:bCs/>
-          <w:kern w:val="0"/>
-          <w:szCs w:val="24"/>
-          <w:lang w:val="en-US"/>
-          <w14:ligatures w14:val="none"/>
-        </w:rPr>
-        <w:t>befejeződjön</w:t>
-      </w:r>
-      <w:proofErr w:type="spellEnd"/>
-      <w:r>
-        <w:rPr>
-          <w:rFonts w:ascii="Verdana" w:eastAsia="Times New Roman" w:hAnsi="Verdana" w:cs="Times New Roman"/>
-          <w:bCs/>
-          <w:kern w:val="0"/>
-          <w:szCs w:val="24"/>
-          <w:lang w:val="en-US"/>
-          <w14:ligatures w14:val="none"/>
-        </w:rPr>
-        <w:t>.</w:t>
+        <w:t>A projekt határidőre, megfelelő minőségű végtermékek átadásával befejeződjön.</w:t>
       </w:r>
     </w:p>
     <w:p>
@@ -2022,103 +1429,7 @@
           <w:lang w:val="en-US"/>
           <w14:ligatures w14:val="none"/>
         </w:rPr>
-        <w:t xml:space="preserve">A </w:t>
-      </w:r>
-      <w:proofErr w:type="spellStart"/>
-      <w:r>
-        <w:rPr>
-          <w:rFonts w:ascii="Verdana" w:eastAsia="Times New Roman" w:hAnsi="Verdana" w:cs="Times New Roman"/>
-          <w:bCs/>
-          <w:kern w:val="0"/>
-          <w:szCs w:val="24"/>
-          <w:lang w:val="en-US"/>
-          <w14:ligatures w14:val="none"/>
-        </w:rPr>
-        <w:t>projekt</w:t>
-      </w:r>
-      <w:proofErr w:type="spellEnd"/>
-      <w:r>
-        <w:rPr>
-          <w:rFonts w:ascii="Verdana" w:eastAsia="Times New Roman" w:hAnsi="Verdana" w:cs="Times New Roman"/>
-          <w:bCs/>
-          <w:kern w:val="0"/>
-          <w:szCs w:val="24"/>
-          <w:lang w:val="en-US"/>
-          <w14:ligatures w14:val="none"/>
-        </w:rPr>
-        <w:t xml:space="preserve"> </w:t>
-      </w:r>
-      <w:proofErr w:type="spellStart"/>
-      <w:r>
-        <w:rPr>
-          <w:rFonts w:ascii="Verdana" w:eastAsia="Times New Roman" w:hAnsi="Verdana" w:cs="Times New Roman"/>
-          <w:bCs/>
-          <w:kern w:val="0"/>
-          <w:szCs w:val="24"/>
-          <w:lang w:val="en-US"/>
-          <w14:ligatures w14:val="none"/>
-        </w:rPr>
-        <w:t>céljai</w:t>
-      </w:r>
-      <w:proofErr w:type="spellEnd"/>
-      <w:r>
-        <w:rPr>
-          <w:rFonts w:ascii="Verdana" w:eastAsia="Times New Roman" w:hAnsi="Verdana" w:cs="Times New Roman"/>
-          <w:bCs/>
-          <w:kern w:val="0"/>
-          <w:szCs w:val="24"/>
-          <w:lang w:val="en-US"/>
-          <w14:ligatures w14:val="none"/>
-        </w:rPr>
-        <w:t xml:space="preserve"> </w:t>
-      </w:r>
-      <w:proofErr w:type="spellStart"/>
-      <w:r>
-        <w:rPr>
-          <w:rFonts w:ascii="Verdana" w:eastAsia="Times New Roman" w:hAnsi="Verdana" w:cs="Times New Roman"/>
-          <w:bCs/>
-          <w:kern w:val="0"/>
-          <w:szCs w:val="24"/>
-          <w:lang w:val="en-US"/>
-          <w14:ligatures w14:val="none"/>
-        </w:rPr>
-        <w:t>maradéktalanul</w:t>
-      </w:r>
-      <w:proofErr w:type="spellEnd"/>
-      <w:r>
-        <w:rPr>
-          <w:rFonts w:ascii="Verdana" w:eastAsia="Times New Roman" w:hAnsi="Verdana" w:cs="Times New Roman"/>
-          <w:bCs/>
-          <w:kern w:val="0"/>
-          <w:szCs w:val="24"/>
-          <w:lang w:val="en-US"/>
-          <w14:ligatures w14:val="none"/>
-        </w:rPr>
-        <w:t xml:space="preserve"> </w:t>
-      </w:r>
-      <w:proofErr w:type="spellStart"/>
-      <w:r>
-        <w:rPr>
-          <w:rFonts w:ascii="Verdana" w:eastAsia="Times New Roman" w:hAnsi="Verdana" w:cs="Times New Roman"/>
-          <w:bCs/>
-          <w:kern w:val="0"/>
-          <w:szCs w:val="24"/>
-          <w:lang w:val="en-US"/>
-          <w14:ligatures w14:val="none"/>
-        </w:rPr>
-        <w:t>teljesüljenek</w:t>
-      </w:r>
-      <w:proofErr w:type="spellEnd"/>
-      <w:r>
-        <w:rPr>
-          <w:rFonts w:ascii="Verdana" w:eastAsia="Times New Roman" w:hAnsi="Verdana" w:cs="Times New Roman"/>
-          <w:bCs/>
-          <w:kern w:val="0"/>
-          <w:szCs w:val="24"/>
-          <w:lang w:val="en-US"/>
-          <w14:ligatures w14:val="none"/>
-        </w:rPr>
-        <w:t>.</w:t>
+        <w:t>A projekt céljai maradéktalanul teljesüljenek.</w:t>
       </w:r>
     </w:p>
     <w:p>
@@ -2147,7 +1458,7 @@
         </w:rPr>
       </w:pPr>
       <w:bookmarkStart w:id="12" w:name="_Toc236207474"/>
-      <w:bookmarkStart w:id="13" w:name="_Toc241227788"/>
+      <w:bookmarkStart w:id="13" w:name="_Toc243747031"/>
       <w:r>
         <w:rPr>
           <w:rFonts w:ascii="Verdana" w:eastAsia="Times New Roman" w:hAnsi="Verdana" w:cs="Arial"/>
@@ -2187,24 +1498,6 @@
         </w:rPr>
         <w:t>Az alábbi feltételek teljesülése esetén tekinthetjük sikeresnek a jelen projektet:</w:t>
       </w:r>
-      <w:r>
-        <w:rPr>
-          <w:rFonts w:ascii="Verdana" w:eastAsia="Times New Roman" w:hAnsi="Verdana" w:cs="Times New Roman"/>
-          <w:kern w:val="0"/>
-          <w:szCs w:val="24"/>
-          <w:lang w:eastAsia="hu-HU"/>
-          <w14:ligatures w14:val="none"/>
-        </w:rPr>
-      </w:r>
-      <w:r>
-        <w:rPr>
-          <w:rFonts w:ascii="Verdana" w:eastAsia="Times New Roman" w:hAnsi="Verdana" w:cs="Times New Roman"/>
-          <w:kern w:val="0"/>
-          <w:szCs w:val="24"/>
-          <w:lang w:eastAsia="hu-HU"/>
-          <w14:ligatures w14:val="none"/>
-        </w:rPr>
-      </w:r>
     </w:p>
     <w:p>
       <w:pPr>
@@ -2255,7 +1548,6 @@
         </w:rPr>
         <w:t>ekt</w:t>
       </w:r>
-      <w:proofErr w:type="spellStart"/>
       <w:r>
         <w:rPr>
           <w:rFonts w:ascii="Verdana" w:eastAsia="Times New Roman" w:hAnsi="Verdana" w:cs="Times New Roman"/>
@@ -2264,18 +1556,7 @@
           <w:lang w:val="en-US"/>
           <w14:ligatures w14:val="none"/>
         </w:rPr>
-        <w:t>célja</w:t>
-      </w:r>
-      <w:proofErr w:type="spellEnd"/>
-      <w:r>
-        <w:rPr>
-          <w:rFonts w:ascii="Verdana" w:eastAsia="Times New Roman" w:hAnsi="Verdana" w:cs="Times New Roman"/>
-          <w:kern w:val="0"/>
-          <w:szCs w:val="24"/>
-          <w:lang w:val="en-US"/>
-          <w14:ligatures w14:val="none"/>
-        </w:rPr>
-        <w:t xml:space="preserve"> </w:t>
+        <w:t xml:space="preserve">célja </w:t>
       </w:r>
       <w:r>
         <w:rPr>
@@ -2425,7 +1706,7 @@
         </w:rPr>
       </w:pPr>
       <w:bookmarkStart w:id="15" w:name="_Toc236207478"/>
-      <w:bookmarkStart w:id="16" w:name="_Toc241227789"/>
+      <w:bookmarkStart w:id="16" w:name="_Toc243747032"/>
       <w:bookmarkEnd w:id="14"/>
       <w:r>
         <w:rPr>
@@ -2496,29 +1777,7 @@
           <w:lang w:eastAsia="hu-HU"/>
           <w14:ligatures w14:val="none"/>
         </w:rPr>
-        <w:t xml:space="preserve">A </w:t>
-      </w:r>
-      <w:proofErr w:type="spellStart"/>
-      <w:r>
-        <w:rPr>
-          <w:rFonts w:ascii="Verdana" w:eastAsia="Times New Roman" w:hAnsi="Verdana" w:cs="Times New Roman"/>
-          <w:kern w:val="0"/>
-          <w:szCs w:val="24"/>
-          <w:lang w:eastAsia="hu-HU"/>
-          <w14:ligatures w14:val="none"/>
-        </w:rPr>
-        <w:t>projekmunkának</w:t>
-      </w:r>
-      <w:proofErr w:type="spellEnd"/>
-      <w:r>
-        <w:rPr>
-          <w:rFonts w:ascii="Verdana" w:eastAsia="Times New Roman" w:hAnsi="Verdana" w:cs="Times New Roman"/>
-          <w:kern w:val="0"/>
-          <w:szCs w:val="24"/>
-          <w:lang w:eastAsia="hu-HU"/>
-          <w14:ligatures w14:val="none"/>
-        </w:rPr>
-        <w:t xml:space="preserve"> </w:t>
+        <w:t xml:space="preserve">A projekmunkának </w:t>
       </w:r>
       <w:r>
         <w:rPr>
@@ -2643,23 +1902,13 @@
                 <w:szCs w:val="24"/>
               </w:rPr>
             </w:pPr>
-            <w:proofErr w:type="spellStart"/>
             <w:r>
               <w:rPr>
                 <w:rFonts w:ascii="Verdana" w:hAnsi="Verdana"/>
                 <w:b/>
                 <w:szCs w:val="24"/>
               </w:rPr>
-              <w:t>Neptun</w:t>
-            </w:r>
-            <w:proofErr w:type="spellEnd"/>
-            <w:r>
-              <w:rPr>
-                <w:rFonts w:ascii="Verdana" w:hAnsi="Verdana"/>
-                <w:b/>
-                <w:szCs w:val="24"/>
-              </w:rPr>
-              <w:t>-kód</w:t>
+              <w:t>Neptun-kód</w:t>
             </w:r>
           </w:p>
         </w:tc>
@@ -2771,6 +2020,13 @@
                 <w:szCs w:val="24"/>
               </w:rPr>
             </w:pPr>
+            <w:r>
+              <w:rPr>
+                <w:rFonts w:ascii="Verdana" w:hAnsi="Verdana"/>
+                <w:szCs w:val="24"/>
+              </w:rPr>
+              <w:t>Riskó Bence Zsolt</w:t>
+            </w:r>
           </w:p>
         </w:tc>
         <w:tc>
@@ -2787,6 +2043,13 @@
                 <w:szCs w:val="24"/>
               </w:rPr>
             </w:pPr>
+            <w:r>
+              <w:rPr>
+                <w:rFonts w:ascii="Verdana" w:hAnsi="Verdana"/>
+                <w:szCs w:val="24"/>
+              </w:rPr>
+              <w:t>z18w7o</w:t>
+            </w:r>
           </w:p>
         </w:tc>
         <w:tc>
@@ -2810,6 +2073,13 @@
               </w:rPr>
               <w:t>projektvezető</w:t>
             </w:r>
+            <w:r>
+              <w:rPr>
+                <w:rFonts w:ascii="Verdana" w:hAnsi="Verdana"/>
+                <w:szCs w:val="24"/>
+              </w:rPr>
+              <w:t>/fejlesztő</w:t>
+            </w:r>
           </w:p>
         </w:tc>
         <w:tc>
@@ -2826,6 +2096,13 @@
                 <w:szCs w:val="24"/>
               </w:rPr>
             </w:pPr>
+            <w:r>
+              <w:rPr>
+                <w:rFonts w:ascii="Verdana" w:hAnsi="Verdana"/>
+                <w:szCs w:val="24"/>
+              </w:rPr>
+              <w:t>riskobence@gmail.com</w:t>
+            </w:r>
           </w:p>
         </w:tc>
         <w:tc>
@@ -2843,6 +2120,13 @@
                 <w:szCs w:val="24"/>
               </w:rPr>
             </w:pPr>
+            <w:r>
+              <w:rPr>
+                <w:rFonts w:ascii="Verdana" w:hAnsi="Verdana"/>
+                <w:szCs w:val="24"/>
+              </w:rPr>
+              <w:t>50</w:t>
+            </w:r>
             <w:r>
               <w:rPr>
                 <w:rFonts w:ascii="Verdana" w:hAnsi="Verdana"/>
@@ -2868,6 +2152,12 @@
                 <w:szCs w:val="24"/>
               </w:rPr>
             </w:pPr>
+            <w:r>
+              <w:rPr>
+                <w:rFonts w:ascii="Verdana" w:hAnsi="Verdana"/>
+              </w:rPr>
+              <w:t>Palócz-Medla Norbert Balázs</w:t>
+            </w:r>
           </w:p>
         </w:tc>
         <w:tc>
@@ -2884,6 +2174,12 @@
                 <w:szCs w:val="24"/>
               </w:rPr>
             </w:pPr>
+            <w:r>
+              <w:rPr>
+                <w:rFonts w:ascii="Verdana" w:hAnsi="Verdana"/>
+              </w:rPr>
+              <w:t>SFYS81</w:t>
+            </w:r>
           </w:p>
         </w:tc>
         <w:tc>
@@ -2923,6 +2219,12 @@
                 <w:szCs w:val="24"/>
               </w:rPr>
             </w:pPr>
+            <w:r>
+              <w:rPr>
+                <w:rFonts w:ascii="Verdana" w:hAnsi="Verdana"/>
+              </w:rPr>
+              <w:t>balazs.paloczmedla@gmail.com</w:t>
+            </w:r>
           </w:p>
         </w:tc>
         <w:tc>
@@ -2945,7 +2247,7 @@
                 <w:rFonts w:ascii="Verdana" w:hAnsi="Verdana"/>
                 <w:szCs w:val="24"/>
               </w:rPr>
-              <w:t>%</w:t>
+              <w:t>25%</w:t>
             </w:r>
           </w:p>
         </w:tc>
@@ -2965,6 +2267,12 @@
                 <w:szCs w:val="24"/>
               </w:rPr>
             </w:pPr>
+            <w:r>
+              <w:rPr>
+                <w:rFonts w:ascii="Verdana" w:hAnsi="Verdana"/>
+              </w:rPr>
+              <w:t>Csizmadi András</w:t>
+            </w:r>
           </w:p>
         </w:tc>
         <w:tc>
@@ -2981,6 +2289,12 @@
                 <w:szCs w:val="24"/>
               </w:rPr>
             </w:pPr>
+            <w:r>
+              <w:rPr>
+                <w:rFonts w:ascii="Verdana" w:hAnsi="Verdana"/>
+              </w:rPr>
+              <w:t>SNL7BM</w:t>
+            </w:r>
           </w:p>
         </w:tc>
         <w:tc>
@@ -3020,6 +2334,13 @@
                 <w:szCs w:val="24"/>
               </w:rPr>
             </w:pPr>
+            <w:r>
+              <w:rPr>
+                <w:rFonts w:ascii="Verdana" w:hAnsi="Verdana"/>
+                <w:szCs w:val="24"/>
+              </w:rPr>
+              <w:t>csizmadia.andras@gmail.com</w:t>
+            </w:r>
           </w:p>
         </w:tc>
         <w:tc>
@@ -3042,116 +2363,7 @@
                 <w:rFonts w:ascii="Verdana" w:hAnsi="Verdana"/>
                 <w:szCs w:val="24"/>
               </w:rPr>
-              <w:t>%</w:t>
-            </w:r>
-          </w:p>
-        </w:tc>
-      </w:tr>
-      <w:tr>
-        <w:tc>
-          <w:tcPr>
-            <w:tcW w:w="2405" w:type="dxa"/>
-            <w:tcBorders>
-              <w:bottom w:val="single" w:sz="4" w:space="0" w:color="auto"/>
-            </w:tcBorders>
-          </w:tcPr>
-          <w:p>
-            <w:pPr>
-              <w:tabs>
-                <w:tab w:val="center" w:pos="7380"/>
-              </w:tabs>
-              <w:rPr>
-                <w:rFonts w:ascii="Verdana" w:hAnsi="Verdana"/>
-                <w:szCs w:val="24"/>
-              </w:rPr>
-            </w:pPr>
-          </w:p>
-        </w:tc>
-        <w:tc>
-          <w:tcPr>
-            <w:tcW w:w="1418" w:type="dxa"/>
-            <w:tcBorders>
-              <w:bottom w:val="single" w:sz="4" w:space="0" w:color="auto"/>
-            </w:tcBorders>
-          </w:tcPr>
-          <w:p>
-            <w:pPr>
-              <w:tabs>
-                <w:tab w:val="center" w:pos="7380"/>
-              </w:tabs>
-              <w:rPr>
-                <w:rFonts w:ascii="Verdana" w:hAnsi="Verdana"/>
-                <w:szCs w:val="24"/>
-              </w:rPr>
-            </w:pPr>
-          </w:p>
-        </w:tc>
-        <w:tc>
-          <w:tcPr>
-            <w:tcW w:w="1984" w:type="dxa"/>
-            <w:tcBorders>
-              <w:bottom w:val="single" w:sz="4" w:space="0" w:color="auto"/>
-            </w:tcBorders>
-          </w:tcPr>
-          <w:p>
-            <w:pPr>
-              <w:tabs>
-                <w:tab w:val="center" w:pos="7380"/>
-              </w:tabs>
-              <w:rPr>
-                <w:rFonts w:ascii="Verdana" w:hAnsi="Verdana"/>
-                <w:szCs w:val="24"/>
-              </w:rPr>
-            </w:pPr>
-            <w:r>
-              <w:rPr>
-                <w:rFonts w:ascii="Verdana" w:hAnsi="Verdana"/>
-                <w:szCs w:val="24"/>
-              </w:rPr>
-              <w:t>fejlesztő</w:t>
-            </w:r>
-          </w:p>
-        </w:tc>
-        <w:tc>
-          <w:tcPr>
-            <w:tcW w:w="2409" w:type="dxa"/>
-            <w:tcBorders>
-              <w:bottom w:val="single" w:sz="4" w:space="0" w:color="auto"/>
-            </w:tcBorders>
-          </w:tcPr>
-          <w:p>
-            <w:pPr>
-              <w:tabs>
-                <w:tab w:val="center" w:pos="7380"/>
-              </w:tabs>
-              <w:rPr>
-                <w:rFonts w:ascii="Verdana" w:hAnsi="Verdana"/>
-                <w:szCs w:val="24"/>
-              </w:rPr>
-            </w:pPr>
-          </w:p>
-        </w:tc>
-        <w:tc>
-          <w:tcPr>
-            <w:tcW w:w="1985" w:type="dxa"/>
-          </w:tcPr>
-          <w:p>
-            <w:pPr>
-              <w:tabs>
-                <w:tab w:val="center" w:pos="7380"/>
-              </w:tabs>
-              <w:jc w:val="center"/>
-              <w:rPr>
-                <w:rFonts w:ascii="Verdana" w:hAnsi="Verdana"/>
-                <w:szCs w:val="24"/>
-              </w:rPr>
-            </w:pPr>
-            <w:r>
-              <w:rPr>
-                <w:rFonts w:ascii="Verdana" w:hAnsi="Verdana"/>
-                <w:szCs w:val="24"/>
-              </w:rPr>
-              <w:t>%</w:t>
+              <w:t>25%</w:t>
             </w:r>
           </w:p>
         </w:tc>
@@ -3294,26 +2506,20 @@
       <w:r>
         <w:rPr>
           <w:rFonts w:ascii="Verdana" w:hAnsi="Verdana"/>
-          <w:highlight w:val="yellow"/>
-        </w:rPr>
-        <w:t>Projektvezető [név] a projektben végzett tevékenysége: a projekt irányítása és ütemezése, a projekt alapító dokumentum elkészítése, a csapat koordinálása, valamint a 3. rész (PowerPoint bemutató, promóciós weblap, elégedettségi űrlap) elkészítése.</w:t>
-      </w:r>
-      <w:proofErr w:type="spellStart"/>
+        </w:rPr>
+        <w:t xml:space="preserve">Projektvezető </w:t>
+      </w:r>
       <w:r>
         <w:rPr>
           <w:rFonts w:ascii="Verdana" w:hAnsi="Verdana"/>
         </w:rPr>
-      </w:r>
-      <w:proofErr w:type="spellEnd"/>
+        <w:t>Riskó Bence Zsolt</w:t>
+      </w:r>
       <w:r>
         <w:rPr>
           <w:rFonts w:ascii="Verdana" w:hAnsi="Verdana"/>
         </w:rPr>
-      </w:r>
-      <w:r>
-        <w:rPr>
-          <w:rFonts w:ascii="Verdana" w:hAnsi="Verdana"/>
-        </w:rPr>
+        <w:t xml:space="preserve"> a projektben végzett tevékenysége: a projekt irányítása és ütemezése, a projekt alapító dokumentum elkészítése, a csapat koordinálása, valamint a PowerPoint bemutató, promóciós weblap, elégedettségi űrlap elkészítése.</w:t>
       </w:r>
     </w:p>
     <w:p>
@@ -3328,1474 +2534,245 @@
       <w:r>
         <w:rPr>
           <w:rFonts w:ascii="Verdana" w:hAnsi="Verdana"/>
-          <w:highlight w:val="yellow"/>
-        </w:rPr>
-        <w:t>Projekttag 1 [név] a projektben végzett tevékenysége: az 1. rész, a cégbemutató Word dokumentum elkészítése.</w:t>
-      </w:r>
-      <w:proofErr w:type="spellStart"/>
+        </w:rPr>
+        <w:t>Projekttag 1 Palócz-Medla Norbert Balázs a projektben végzett tevékenysége: a cégbemutató Word dokumentum elkészítése</w:t>
+      </w:r>
       <w:r>
         <w:rPr>
           <w:rFonts w:ascii="Verdana" w:hAnsi="Verdana"/>
         </w:rPr>
-      </w:r>
-      <w:proofErr w:type="spellEnd"/>
+        <w:t>. A</w:t>
+      </w:r>
       <w:r>
         <w:rPr>
           <w:rFonts w:ascii="Verdana" w:hAnsi="Verdana"/>
         </w:rPr>
-      </w:r>
-      <w:r>
-        <w:rPr>
-          <w:rFonts w:ascii="Verdana" w:hAnsi="Verdana"/>
-        </w:rPr>
+        <w:t xml:space="preserve"> 10 oldalas dokumentum felépítése (kilenc fejezet: küldetés, vállalkozás-bemutatás, szolgáltatások, árlista, működési folyamatok, pénzügyi áttekintés, szervezet, kapcsolat, összegzés), automatikus tartalomjegyzék és ábrajegyzék Word-mezőkkel, H1–H3 címsorstílusok, élőfej és oldalszámozott élőláb, öt táblázat, négy ábra, lábjegyzet és öt hivatkozott forrás. </w:t>
       </w:r>
     </w:p>
     <w:p>
       <w:pPr>
-        <w:pStyle w:val="Szvegtrzsbehzssal"/>
-        <w:spacing w:before="240"/>
-        <w:ind w:left="0"/>
-        <w:rPr>
-          <w:rFonts w:ascii="Verdana" w:hAnsi="Verdana"/>
-        </w:rPr>
-      </w:pPr>
-      <w:r>
-        <w:rPr>
-          <w:rFonts w:ascii="Verdana" w:hAnsi="Verdana"/>
-          <w:highlight w:val="yellow"/>
-        </w:rPr>
-        <w:t>Projekttag 2 [név] a projektben végzett tevékenysége: a 2. rész, a forgalmi Excel munkafüzet és a grafikonok elkészítése.</w:t>
-      </w:r>
-      <w:proofErr w:type="spellStart"/>
-      <w:r>
-        <w:rPr>
-          <w:rFonts w:ascii="Verdana" w:hAnsi="Verdana"/>
-        </w:rPr>
-      </w:r>
-      <w:proofErr w:type="spellEnd"/>
-      <w:r>
-        <w:rPr>
-          <w:rFonts w:ascii="Verdana" w:hAnsi="Verdana"/>
-        </w:rPr>
-      </w:r>
-      <w:r>
-        <w:rPr>
-          <w:rFonts w:ascii="Verdana" w:hAnsi="Verdana"/>
-        </w:rPr>
+        <w:tabs>
+          <w:tab w:val="center" w:pos="7380"/>
+        </w:tabs>
+        <w:spacing w:before="120" w:after="120" w:line="276" w:lineRule="auto"/>
+        <w:rPr>
+          <w:rFonts w:ascii="Verdana" w:eastAsia="Times New Roman" w:hAnsi="Verdana" w:cs="Times New Roman"/>
+          <w:kern w:val="0"/>
+          <w:szCs w:val="24"/>
+          <w:lang w:eastAsia="hu-HU"/>
+          <w14:ligatures w14:val="none"/>
+        </w:rPr>
+      </w:pPr>
+      <w:r>
+        <w:rPr>
+          <w:rFonts w:ascii="Verdana" w:eastAsia="Times New Roman" w:hAnsi="Verdana" w:cs="Times New Roman"/>
+          <w:kern w:val="0"/>
+          <w:szCs w:val="24"/>
+          <w:lang w:eastAsia="hu-HU"/>
+          <w14:ligatures w14:val="none"/>
+        </w:rPr>
+        <w:t>Projekttag 2 Csizmadi András a projektben végzett tevékenysége</w:t>
+      </w:r>
+      <w:r>
+        <w:rPr>
+          <w:rFonts w:ascii="Verdana" w:eastAsia="Times New Roman" w:hAnsi="Verdana" w:cs="Times New Roman"/>
+          <w:b/>
+          <w:bCs/>
+          <w:kern w:val="0"/>
+          <w:szCs w:val="24"/>
+          <w:lang w:eastAsia="hu-HU"/>
+          <w14:ligatures w14:val="none"/>
+        </w:rPr>
+        <w:t>:</w:t>
+      </w:r>
+      <w:r>
+        <w:rPr>
+          <w:rFonts w:ascii="Verdana" w:eastAsia="Times New Roman" w:hAnsi="Verdana" w:cs="Times New Roman"/>
+          <w:kern w:val="0"/>
+          <w:szCs w:val="24"/>
+          <w:lang w:eastAsia="hu-HU"/>
+          <w14:ligatures w14:val="none"/>
+        </w:rPr>
+        <w:t xml:space="preserve"> a 2. rész, a forgalmi Excel munkafüzet elkészítése. Az </w:t>
+      </w:r>
+      <w:r>
+        <w:rPr>
+          <w:rFonts w:ascii="Verdana" w:eastAsia="Times New Roman" w:hAnsi="Verdana" w:cs="Times New Roman"/>
+          <w:i/>
+          <w:iCs/>
+          <w:kern w:val="0"/>
+          <w:szCs w:val="24"/>
+          <w:lang w:eastAsia="hu-HU"/>
+          <w14:ligatures w14:val="none"/>
+        </w:rPr>
+        <w:t>Adatok</w:t>
+      </w:r>
+      <w:r>
+        <w:rPr>
+          <w:rFonts w:ascii="Verdana" w:eastAsia="Times New Roman" w:hAnsi="Verdana" w:cs="Times New Roman"/>
+          <w:kern w:val="0"/>
+          <w:szCs w:val="24"/>
+          <w:lang w:eastAsia="hu-HU"/>
+          <w14:ligatures w14:val="none"/>
+        </w:rPr>
+        <w:t xml:space="preserve"> munkalapon rögzítette a 12 havi bevételi és kiadási adatot, a kiadási kategóriákat és a javítási típusok darabszámát. Az </w:t>
+      </w:r>
+      <w:r>
+        <w:rPr>
+          <w:rFonts w:ascii="Verdana" w:eastAsia="Times New Roman" w:hAnsi="Verdana" w:cs="Times New Roman"/>
+          <w:i/>
+          <w:iCs/>
+          <w:kern w:val="0"/>
+          <w:szCs w:val="24"/>
+          <w:lang w:eastAsia="hu-HU"/>
+          <w14:ligatures w14:val="none"/>
+        </w:rPr>
+        <w:t>Összesítés</w:t>
+      </w:r>
+      <w:r>
+        <w:rPr>
+          <w:rFonts w:ascii="Verdana" w:eastAsia="Times New Roman" w:hAnsi="Verdana" w:cs="Times New Roman"/>
+          <w:kern w:val="0"/>
+          <w:szCs w:val="24"/>
+          <w:lang w:eastAsia="hu-HU"/>
+          <w14:ligatures w14:val="none"/>
+        </w:rPr>
+        <w:t xml:space="preserve"> munkalapon függvényekkel (SZUM, ÁTLAG, MAX, MIN, DARABTELI) kiszámította az éves összegeket, az átlagokat, a szélsőértékeket és a javítási típusok arányát, majd három diagramot készített hozzájuk</w:t>
+      </w:r>
+      <w:r>
+        <w:rPr>
+          <w:rFonts w:ascii="Verdana" w:eastAsia="Times New Roman" w:hAnsi="Verdana" w:cs="Times New Roman"/>
+          <w:kern w:val="0"/>
+          <w:szCs w:val="24"/>
+          <w:lang w:eastAsia="hu-HU"/>
+          <w14:ligatures w14:val="none"/>
+        </w:rPr>
+        <w:t>.</w:t>
       </w:r>
     </w:p>
     <w:p>
       <w:pPr>
-        <w:pStyle w:val="Szvegtrzsbehzssal"/>
-        <w:spacing w:before="240"/>
-        <w:ind w:left="0"/>
-        <w:rPr>
-          <w:rFonts w:ascii="Verdana" w:hAnsi="Verdana"/>
-        </w:rPr>
-      </w:pPr>
-      <w:r>
-        <w:rPr>
-          <w:rFonts w:ascii="Verdana" w:hAnsi="Verdana"/>
-          <w:highlight w:val="yellow"/>
-        </w:rPr>
-        <w:t>Projekttag 3 [név] a projektben végzett tevékenysége: [feladat megadása, pl. tartalmi és formai ellenőrzés, források, képek gyűjtése – vagy törölhető].</w:t>
-      </w:r>
-      <w:proofErr w:type="spellStart"/>
-      <w:r>
-        <w:rPr>
-          <w:rFonts w:ascii="Verdana" w:hAnsi="Verdana"/>
-        </w:rPr>
-      </w:r>
-      <w:proofErr w:type="spellEnd"/>
-      <w:r>
-        <w:rPr>
-          <w:rFonts w:ascii="Verdana" w:hAnsi="Verdana"/>
-        </w:rPr>
-      </w:r>
-      <w:r>
-        <w:rPr>
-          <w:rFonts w:ascii="Verdana" w:hAnsi="Verdana"/>
-        </w:rPr>
-      </w:r>
-    </w:p>
-    <w:p>
-      <w:pPr>
         <w:tabs>
           <w:tab w:val="center" w:pos="7380"/>
         </w:tabs>
         <w:spacing w:before="120" w:after="120" w:line="276" w:lineRule="auto"/>
-        <w:jc w:val="both"/>
-        <w:rPr>
-          <w:rFonts w:ascii="Verdana" w:eastAsia="Times New Roman" w:hAnsi="Verdana" w:cs="Times New Roman"/>
-          <w:kern w:val="0"/>
-          <w:szCs w:val="24"/>
-          <w:lang w:eastAsia="hu-HU"/>
-          <w14:ligatures w14:val="none"/>
-        </w:rPr>
-      </w:pPr>
-    </w:p>
-    <w:p>
-      <w:pPr>
-        <w:tabs>
-          <w:tab w:val="center" w:pos="7380"/>
-        </w:tabs>
-        <w:spacing w:before="120" w:after="120" w:line="276" w:lineRule="auto"/>
-        <w:rPr>
-          <w:rFonts w:ascii="Verdana" w:eastAsia="Times New Roman" w:hAnsi="Verdana" w:cs="Times New Roman"/>
-          <w:kern w:val="0"/>
-          <w:szCs w:val="24"/>
-          <w:lang w:eastAsia="hu-HU"/>
-          <w14:ligatures w14:val="none"/>
-        </w:rPr>
-      </w:pPr>
-      <w:r>
         <w:rPr>
           <w:rFonts w:ascii="Verdana" w:hAnsi="Verdana"/>
           <w:b/>
           <w:bCs/>
         </w:rPr>
-        <w:t xml:space="preserve">Videó és fileok elérhetősége: </w:t>
-      </w:r>
+      </w:pPr>
       <w:r>
         <w:rPr>
           <w:rFonts w:ascii="Verdana" w:hAnsi="Verdana"/>
           <w:b/>
           <w:bCs/>
-          <w:highlight w:val="yellow"/>
-        </w:rPr>
-        <w:t>[Hozzáférhető link]</w:t>
-      </w:r>
-      <w:r>
-        <w:rPr>
-          <w:rFonts w:ascii="Verdana" w:hAnsi="Verdana"/>
+        </w:rPr>
+        <w:t xml:space="preserve">Videó és fileok elérhetősége: </w:t>
+      </w:r>
+      <w:hyperlink r:id="rId12" w:history="1">
+        <w:r>
+          <w:rPr>
+            <w:rStyle w:val="Hiperhivatkozs"/>
+            <w:rFonts w:ascii="Verdana" w:hAnsi="Verdana"/>
+            <w:b/>
+            <w:bCs/>
+          </w:rPr>
+          <w:t>Info.alapok.projekt</w:t>
+        </w:r>
+      </w:hyperlink>
+    </w:p>
+    <w:p>
+      <w:pPr>
+        <w:tabs>
+          <w:tab w:val="center" w:pos="7380"/>
+        </w:tabs>
+        <w:spacing w:before="120" w:after="120" w:line="276" w:lineRule="auto"/>
+        <w:jc w:val="both"/>
+        <w:rPr>
+          <w:rFonts w:ascii="Verdana" w:eastAsia="Times New Roman" w:hAnsi="Verdana" w:cs="Times New Roman"/>
           <w:b/>
           <w:bCs/>
-        </w:rPr>
-      </w:r>
-      <w:r>
-        <w:rPr>
-          <w:rFonts w:ascii="Verdana" w:hAnsi="Verdana"/>
+          <w:kern w:val="0"/>
+          <w:szCs w:val="24"/>
+          <w:lang w:eastAsia="hu-HU"/>
+          <w14:ligatures w14:val="none"/>
+        </w:rPr>
+      </w:pPr>
+      <w:r>
+        <w:rPr>
+          <w:rFonts w:ascii="Verdana" w:eastAsia="Times New Roman" w:hAnsi="Verdana" w:cs="Times New Roman"/>
           <w:b/>
           <w:bCs/>
-        </w:rPr>
-      </w:r>
-      <w:r>
-        <w:rPr>
-          <w:rFonts w:ascii="Verdana" w:hAnsi="Verdana"/>
+          <w:kern w:val="0"/>
+          <w:szCs w:val="24"/>
+          <w:lang w:eastAsia="hu-HU"/>
+          <w14:ligatures w14:val="none"/>
+        </w:rPr>
+        <w:t>Weboldal elérhetőség</w:t>
+      </w:r>
+      <w:bookmarkStart w:id="17" w:name="_Ref109108506"/>
+      <w:r>
+        <w:rPr>
+          <w:rFonts w:ascii="Verdana" w:eastAsia="Times New Roman" w:hAnsi="Verdana" w:cs="Times New Roman"/>
           <w:b/>
           <w:bCs/>
-        </w:rPr>
-      </w:r>
-      <w:r>
-        <w:rPr>
-          <w:rFonts w:ascii="Verdana" w:hAnsi="Verdana"/>
-          <w:b/>
-          <w:bCs/>
-        </w:rPr>
-      </w:r>
-    </w:p>
-    <w:p>
-      <w:pPr>
-        <w:tabs>
-          <w:tab w:val="center" w:pos="7380"/>
-        </w:tabs>
-        <w:spacing w:before="120" w:after="120" w:line="276" w:lineRule="auto"/>
-        <w:jc w:val="both"/>
-        <w:rPr>
-          <w:rFonts w:ascii="Verdana" w:eastAsia="Times New Roman" w:hAnsi="Verdana" w:cs="Times New Roman"/>
-          <w:b/>
-          <w:bCs/>
-          <w:kern w:val="0"/>
-          <w:szCs w:val="24"/>
-          <w:lang w:eastAsia="hu-HU"/>
-          <w14:ligatures w14:val="none"/>
-        </w:rPr>
-      </w:pPr>
-      <w:r>
-        <w:rPr>
-          <w:rFonts w:ascii="Verdana" w:eastAsia="Times New Roman" w:hAnsi="Verdana" w:cs="Times New Roman"/>
-          <w:b/>
-          <w:bCs/>
-          <w:kern w:val="0"/>
-          <w:szCs w:val="24"/>
-          <w:lang w:eastAsia="hu-HU"/>
-          <w14:ligatures w14:val="none"/>
-        </w:rPr>
-        <w:t xml:space="preserve">Weboldal elérhetősége: </w:t>
-      </w:r>
-      <w:r>
-        <w:rPr>
-          <w:rFonts w:ascii="Verdana" w:eastAsia="Times New Roman" w:hAnsi="Verdana" w:cs="Times New Roman"/>
-          <w:b/>
-          <w:bCs/>
-          <w:kern w:val="0"/>
-          <w:szCs w:val="24"/>
-          <w:highlight w:val="yellow"/>
-          <w:lang w:eastAsia="hu-HU"/>
-          <w14:ligatures w14:val="none"/>
-        </w:rPr>
-        <w:t>[Hozzáférhető link]</w:t>
-      </w:r>
-      <w:r>
-        <w:rPr>
-          <w:rFonts w:ascii="Verdana" w:hAnsi="Verdana"/>
-          <w:b/>
-          <w:bCs/>
-        </w:rPr>
-      </w:r>
-    </w:p>
-    <w:p>
-      <w:pPr>
-        <w:tabs>
-          <w:tab w:val="center" w:pos="7380"/>
-        </w:tabs>
-        <w:spacing w:before="120" w:after="120" w:line="276" w:lineRule="auto"/>
-        <w:jc w:val="both"/>
-        <w:rPr>
-          <w:rFonts w:ascii="Verdana" w:eastAsia="Times New Roman" w:hAnsi="Verdana" w:cs="Times New Roman"/>
-          <w:kern w:val="0"/>
-          <w:szCs w:val="24"/>
-          <w:lang w:eastAsia="hu-HU"/>
-          <w14:ligatures w14:val="none"/>
-        </w:rPr>
-      </w:pPr>
-    </w:p>
-    <w:p>
-      <w:pPr>
-        <w:rPr>
-          <w:rFonts w:ascii="Verdana" w:eastAsia="Times New Roman" w:hAnsi="Verdana" w:cs="Times New Roman"/>
-          <w:kern w:val="0"/>
-          <w:szCs w:val="24"/>
-          <w:lang w:eastAsia="hu-HU"/>
-          <w14:ligatures w14:val="none"/>
-        </w:rPr>
-      </w:pPr>
-      <w:r>
-        <w:rPr>
-          <w:rFonts w:ascii="Verdana" w:eastAsia="Times New Roman" w:hAnsi="Verdana" w:cs="Times New Roman"/>
-          <w:kern w:val="0"/>
-          <w:szCs w:val="24"/>
-          <w:lang w:eastAsia="hu-HU"/>
-          <w14:ligatures w14:val="none"/>
-        </w:rPr>
-        <w:br w:type="page"/>
-      </w:r>
-    </w:p>
-    <w:p>
-      <w:pPr>
-        <w:spacing w:after="200" w:line="276" w:lineRule="auto"/>
-        <w:rPr>
-          <w:rFonts w:ascii="Verdana" w:eastAsia="Times New Roman" w:hAnsi="Verdana" w:cs="Times New Roman"/>
-          <w:kern w:val="0"/>
-          <w:szCs w:val="24"/>
-          <w14:ligatures w14:val="none"/>
-        </w:rPr>
-        <w:sectPr>
-          <w:pgSz w:w="11907" w:h="16840" w:code="9"/>
-          <w:pgMar w:top="1440" w:right="1797" w:bottom="1440" w:left="1797" w:header="709" w:footer="709" w:gutter="0"/>
-          <w:cols w:space="708"/>
-          <w:titlePg/>
-          <w:docGrid w:linePitch="360"/>
-        </w:sectPr>
-      </w:pPr>
-      <w:bookmarkStart w:id="17" w:name="_Ref109108506"/>
-    </w:p>
-    <w:p>
-      <w:pPr>
-        <w:keepNext/>
-        <w:pageBreakBefore/>
-        <w:tabs>
-          <w:tab w:val="num" w:pos="792"/>
-        </w:tabs>
-        <w:spacing w:before="240" w:after="60" w:line="276" w:lineRule="auto"/>
-        <w:ind w:left="788" w:hanging="431"/>
-        <w:outlineLvl w:val="0"/>
-        <w:rPr>
-          <w:rFonts w:ascii="Verdana" w:eastAsia="Times New Roman" w:hAnsi="Verdana" w:cs="Arial"/>
-          <w:b/>
-          <w:bCs/>
-          <w:kern w:val="32"/>
-          <w:sz w:val="32"/>
-          <w:szCs w:val="32"/>
-          <w14:ligatures w14:val="none"/>
-        </w:rPr>
-      </w:pPr>
-      <w:bookmarkStart w:id="18" w:name="_Toc236207498"/>
-      <w:bookmarkStart w:id="19" w:name="_Toc241227790"/>
-      <w:r>
-        <w:rPr>
-          <w:rFonts w:ascii="Verdana" w:eastAsia="Times New Roman" w:hAnsi="Verdana" w:cs="Arial"/>
-          <w:b/>
-          <w:bCs/>
-          <w:kern w:val="32"/>
-          <w:sz w:val="32"/>
-          <w:szCs w:val="32"/>
-          <w14:ligatures w14:val="none"/>
-        </w:rPr>
-        <w:lastRenderedPageBreak/>
-        <w:t>Mellékletek</w:t>
-      </w:r>
+          <w:kern w:val="0"/>
+          <w:szCs w:val="24"/>
+          <w:lang w:eastAsia="hu-HU"/>
+          <w14:ligatures w14:val="none"/>
+        </w:rPr>
+        <w:t>:</w:t>
+      </w:r>
+      <w:hyperlink r:id="rId13" w:history="1">
+        <w:r>
+          <w:rPr>
+            <w:rStyle w:val="Hiperhivatkozs"/>
+            <w:rFonts w:ascii="Verdana" w:eastAsia="Times New Roman" w:hAnsi="Verdana" w:cs="Times New Roman"/>
+            <w:b/>
+            <w:bCs/>
+            <w:kern w:val="0"/>
+            <w:szCs w:val="24"/>
+            <w:lang w:eastAsia="hu-HU"/>
+            <w14:ligatures w14:val="none"/>
+          </w:rPr>
+          <w:t>https://riskobenc</w:t>
+        </w:r>
+        <w:r>
+          <w:rPr>
+            <w:rStyle w:val="Hiperhivatkozs"/>
+            <w:rFonts w:ascii="Verdana" w:eastAsia="Times New Roman" w:hAnsi="Verdana" w:cs="Times New Roman"/>
+            <w:b/>
+            <w:bCs/>
+            <w:kern w:val="0"/>
+            <w:szCs w:val="24"/>
+            <w:lang w:eastAsia="hu-HU"/>
+            <w14:ligatures w14:val="none"/>
+          </w:rPr>
+          <w:t>e</w:t>
+        </w:r>
+        <w:r>
+          <w:rPr>
+            <w:rStyle w:val="Hiperhivatkozs"/>
+            <w:rFonts w:ascii="Verdana" w:eastAsia="Times New Roman" w:hAnsi="Verdana" w:cs="Times New Roman"/>
+            <w:b/>
+            <w:bCs/>
+            <w:kern w:val="0"/>
+            <w:szCs w:val="24"/>
+            <w:lang w:eastAsia="hu-HU"/>
+            <w14:ligatures w14:val="none"/>
+          </w:rPr>
+          <w:t>.github.io/fixpont-mobilszerviz/</w:t>
+        </w:r>
+      </w:hyperlink>
       <w:bookmarkEnd w:id="17"/>
-      <w:bookmarkEnd w:id="18"/>
-      <w:bookmarkEnd w:id="19"/>
-    </w:p>
-    <w:p>
-      <w:pPr>
-        <w:keepNext/>
-        <w:numPr>
-          <w:ilvl w:val="1"/>
-          <w:numId w:val="0"/>
-        </w:numPr>
-        <w:tabs>
-          <w:tab w:val="num" w:pos="720"/>
-          <w:tab w:val="num" w:pos="936"/>
-        </w:tabs>
-        <w:spacing w:before="240" w:after="60" w:line="276" w:lineRule="auto"/>
-        <w:ind w:left="936" w:hanging="576"/>
-        <w:outlineLvl w:val="1"/>
-        <w:rPr>
-          <w:rFonts w:eastAsia="Times New Roman" w:cs="Times New Roman"/>
-          <w:kern w:val="0"/>
-          <w:szCs w:val="24"/>
-          <w14:ligatures w14:val="none"/>
-        </w:rPr>
-      </w:pPr>
-      <w:bookmarkStart w:id="20" w:name="_Ref109104172"/>
-      <w:bookmarkStart w:id="21" w:name="_Toc236207499"/>
-      <w:bookmarkStart w:id="22" w:name="_Toc241227791"/>
-      <w:r>
-        <w:rPr>
-          <w:rFonts w:ascii="Verdana" w:eastAsia="Times New Roman" w:hAnsi="Verdana" w:cs="Arial"/>
-          <w:b/>
-          <w:bCs/>
-          <w:i/>
-          <w:iCs/>
-          <w:kern w:val="0"/>
-          <w:sz w:val="28"/>
-          <w:szCs w:val="28"/>
-          <w14:ligatures w14:val="none"/>
-        </w:rPr>
-        <w:t>Projekt ütemezése</w:t>
-      </w:r>
-      <w:bookmarkEnd w:id="20"/>
-      <w:bookmarkEnd w:id="21"/>
-      <w:bookmarkEnd w:id="22"/>
-      <w:r>
-        <w:rPr>
-          <w:rFonts w:ascii="Verdana" w:eastAsia="Times New Roman" w:hAnsi="Verdana" w:cs="Arial"/>
-          <w:b/>
-          <w:bCs/>
-          <w:i/>
-          <w:iCs/>
-          <w:kern w:val="0"/>
-          <w:sz w:val="28"/>
-          <w:szCs w:val="28"/>
-          <w14:ligatures w14:val="none"/>
-        </w:rPr>
-        <w:t xml:space="preserve"> </w:t>
-      </w:r>
-      <w:r>
-        <w:rPr>
-          <w:rFonts w:ascii="Verdana" w:eastAsia="Times New Roman" w:hAnsi="Verdana" w:cs="Arial"/>
-          <w:i/>
-          <w:iCs/>
-          <w:kern w:val="0"/>
-          <w:sz w:val="28"/>
-          <w:szCs w:val="28"/>
-          <w14:ligatures w14:val="none"/>
-        </w:rPr>
-        <w:t>(opcionális)</w:t>
-      </w:r>
-    </w:p>
-    <w:p>
-      <w:pPr>
-        <w:spacing w:after="200" w:line="276" w:lineRule="auto"/>
-        <w:rPr>
-          <w:rFonts w:ascii="Verdana" w:eastAsia="Times New Roman" w:hAnsi="Verdana" w:cs="Times New Roman"/>
-          <w:kern w:val="0"/>
-          <w:szCs w:val="24"/>
-          <w14:ligatures w14:val="none"/>
-        </w:rPr>
-      </w:pPr>
-    </w:p>
-    <w:p>
-      <w:pPr>
-        <w:spacing w:after="200" w:line="276" w:lineRule="auto"/>
-        <w:rPr>
-          <w:rFonts w:ascii="Verdana" w:eastAsia="Times New Roman" w:hAnsi="Verdana" w:cs="Times New Roman"/>
-          <w:kern w:val="0"/>
-          <w:szCs w:val="24"/>
-          <w14:ligatures w14:val="none"/>
-        </w:rPr>
-        <w:sectPr>
-          <w:pgSz w:w="11907" w:h="16840" w:code="9"/>
-          <w:pgMar w:top="1440" w:right="1797" w:bottom="1440" w:left="1797" w:header="709" w:footer="709" w:gutter="0"/>
-          <w:cols w:space="708"/>
-          <w:docGrid w:linePitch="360"/>
-        </w:sectPr>
-      </w:pPr>
-    </w:p>
-    <w:p>
-      <w:pPr>
-        <w:keepNext/>
-        <w:numPr>
-          <w:ilvl w:val="1"/>
-          <w:numId w:val="0"/>
-        </w:numPr>
-        <w:tabs>
-          <w:tab w:val="num" w:pos="720"/>
-          <w:tab w:val="num" w:pos="936"/>
-        </w:tabs>
-        <w:spacing w:before="240" w:after="60" w:line="276" w:lineRule="auto"/>
-        <w:ind w:left="936" w:hanging="576"/>
-        <w:outlineLvl w:val="1"/>
-        <w:rPr>
-          <w:rFonts w:ascii="Verdana" w:eastAsia="Times New Roman" w:hAnsi="Verdana" w:cs="Arial"/>
-          <w:b/>
-          <w:bCs/>
-          <w:i/>
-          <w:iCs/>
-          <w:kern w:val="0"/>
-          <w:sz w:val="28"/>
-          <w:szCs w:val="28"/>
-          <w14:ligatures w14:val="none"/>
-        </w:rPr>
-      </w:pPr>
-      <w:bookmarkStart w:id="23" w:name="_Toc236207502"/>
-      <w:bookmarkStart w:id="24" w:name="_Toc241227792"/>
-      <w:r>
-        <w:rPr>
-          <w:rFonts w:ascii="Verdana" w:eastAsia="Times New Roman" w:hAnsi="Verdana" w:cs="Arial"/>
-          <w:b/>
-          <w:bCs/>
-          <w:i/>
-          <w:iCs/>
-          <w:kern w:val="0"/>
-          <w:sz w:val="28"/>
-          <w:szCs w:val="28"/>
-          <w14:ligatures w14:val="none"/>
-        </w:rPr>
-        <w:lastRenderedPageBreak/>
-        <w:t>Emlékeztető minta</w:t>
-      </w:r>
-      <w:bookmarkEnd w:id="23"/>
-      <w:r>
-        <w:rPr>
-          <w:rFonts w:ascii="Verdana" w:eastAsia="Times New Roman" w:hAnsi="Verdana" w:cs="Arial"/>
-          <w:b/>
-          <w:bCs/>
-          <w:i/>
-          <w:iCs/>
-          <w:kern w:val="0"/>
-          <w:sz w:val="28"/>
-          <w:szCs w:val="28"/>
-          <w14:ligatures w14:val="none"/>
-        </w:rPr>
-        <w:t xml:space="preserve"> </w:t>
-      </w:r>
-      <w:r>
-        <w:rPr>
-          <w:rFonts w:ascii="Verdana" w:eastAsia="Times New Roman" w:hAnsi="Verdana" w:cs="Arial"/>
-          <w:i/>
-          <w:iCs/>
-          <w:kern w:val="0"/>
-          <w:sz w:val="28"/>
-          <w:szCs w:val="28"/>
-          <w14:ligatures w14:val="none"/>
-        </w:rPr>
-        <w:t>(</w:t>
-      </w:r>
-      <w:r>
-        <w:rPr>
-          <w:rFonts w:ascii="Verdana" w:eastAsia="Times New Roman" w:hAnsi="Verdana" w:cs="Arial"/>
-          <w:i/>
-          <w:iCs/>
-          <w:kern w:val="0"/>
-          <w:sz w:val="28"/>
-          <w:szCs w:val="28"/>
-          <w14:ligatures w14:val="none"/>
-        </w:rPr>
-        <w:t>opcionális</w:t>
-      </w:r>
-      <w:r>
-        <w:rPr>
-          <w:rFonts w:ascii="Verdana" w:eastAsia="Times New Roman" w:hAnsi="Verdana" w:cs="Arial"/>
-          <w:i/>
-          <w:iCs/>
-          <w:kern w:val="0"/>
-          <w:sz w:val="28"/>
-          <w:szCs w:val="28"/>
-          <w14:ligatures w14:val="none"/>
-        </w:rPr>
-        <w:t>)</w:t>
-      </w:r>
-      <w:bookmarkEnd w:id="24"/>
-    </w:p>
-    <w:p>
-      <w:pPr>
-        <w:spacing w:after="200" w:line="276" w:lineRule="auto"/>
-        <w:rPr>
-          <w:rFonts w:ascii="Verdana" w:eastAsia="Times New Roman" w:hAnsi="Verdana" w:cs="Times New Roman"/>
-          <w:kern w:val="0"/>
-          <w:szCs w:val="24"/>
-          <w14:ligatures w14:val="none"/>
-        </w:rPr>
-      </w:pPr>
-    </w:p>
-    <w:p>
-      <w:pPr>
-        <w:spacing w:after="200" w:line="276" w:lineRule="auto"/>
-        <w:jc w:val="center"/>
-        <w:rPr>
-          <w:rFonts w:ascii="Verdana" w:eastAsia="Times New Roman" w:hAnsi="Verdana" w:cs="Arial"/>
-          <w:kern w:val="0"/>
-          <w:szCs w:val="24"/>
-          <w:lang w:val="en-US"/>
-          <w14:ligatures w14:val="none"/>
-        </w:rPr>
-      </w:pPr>
-    </w:p>
-    <w:p>
-      <w:pPr>
-        <w:spacing w:after="200" w:line="276" w:lineRule="auto"/>
-        <w:jc w:val="center"/>
-        <w:rPr>
-          <w:rFonts w:ascii="Verdana" w:eastAsia="Times New Roman" w:hAnsi="Verdana" w:cs="Arial"/>
-          <w:kern w:val="0"/>
-          <w:szCs w:val="24"/>
-          <w:lang w:val="en-US"/>
-          <w14:ligatures w14:val="none"/>
-        </w:rPr>
-      </w:pPr>
-      <w:r>
-        <w:rPr>
-          <w:rFonts w:ascii="Verdana" w:eastAsia="Times New Roman" w:hAnsi="Verdana" w:cs="Arial"/>
-          <w:kern w:val="0"/>
-          <w:szCs w:val="24"/>
-          <w:lang w:val="en-US"/>
-          <w14:ligatures w14:val="none"/>
-        </w:rPr>
-        <w:t>MEGBESZÉLÉS EMLÉKEZTETŐ</w:t>
-      </w:r>
-      <w:r>
-        <w:rPr>
-          <w:rFonts w:ascii="Verdana" w:eastAsia="Times New Roman" w:hAnsi="Verdana" w:cs="Arial"/>
-          <w:kern w:val="0"/>
-          <w:szCs w:val="24"/>
-          <w:lang w:val="en-US"/>
-          <w14:ligatures w14:val="none"/>
-        </w:rPr>
-        <w:t xml:space="preserve"> (</w:t>
-      </w:r>
-      <w:proofErr w:type="spellStart"/>
-      <w:r>
-        <w:rPr>
-          <w:rFonts w:ascii="Verdana" w:eastAsia="Times New Roman" w:hAnsi="Verdana" w:cs="Arial"/>
-          <w:kern w:val="0"/>
-          <w:szCs w:val="24"/>
-          <w:lang w:val="en-US"/>
-          <w14:ligatures w14:val="none"/>
-        </w:rPr>
-        <w:t>opcionális</w:t>
-      </w:r>
-      <w:proofErr w:type="spellEnd"/>
-      <w:r>
-        <w:rPr>
-          <w:rFonts w:ascii="Verdana" w:eastAsia="Times New Roman" w:hAnsi="Verdana" w:cs="Arial"/>
-          <w:kern w:val="0"/>
-          <w:szCs w:val="24"/>
-          <w:lang w:val="en-US"/>
-          <w14:ligatures w14:val="none"/>
-        </w:rPr>
-        <w:t>)</w:t>
-      </w:r>
-    </w:p>
-    <w:p>
-      <w:pPr>
-        <w:spacing w:after="200" w:line="276" w:lineRule="auto"/>
-        <w:rPr>
-          <w:rFonts w:ascii="Verdana" w:eastAsia="Times New Roman" w:hAnsi="Verdana" w:cs="Times New Roman"/>
-          <w:kern w:val="0"/>
-          <w:szCs w:val="24"/>
-          <w:lang w:val="en-US"/>
-          <w14:ligatures w14:val="none"/>
-        </w:rPr>
-      </w:pPr>
-    </w:p>
-    <w:p>
-      <w:pPr>
-        <w:spacing w:after="200" w:line="276" w:lineRule="auto"/>
-        <w:rPr>
-          <w:rFonts w:ascii="Verdana" w:eastAsia="Times New Roman" w:hAnsi="Verdana" w:cs="Times New Roman"/>
-          <w:kern w:val="0"/>
-          <w:szCs w:val="24"/>
-          <w:lang w:val="en-US"/>
-          <w14:ligatures w14:val="none"/>
-        </w:rPr>
-      </w:pPr>
-    </w:p>
-    <w:tbl>
-      <w:tblPr>
-        <w:tblW w:w="0" w:type="auto"/>
-        <w:tblInd w:w="250" w:type="dxa"/>
-        <w:tblBorders>
-          <w:top w:val="dotted" w:sz="4" w:space="0" w:color="auto"/>
-          <w:left w:val="dotted" w:sz="4" w:space="0" w:color="auto"/>
-          <w:bottom w:val="dotted" w:sz="4" w:space="0" w:color="auto"/>
-          <w:right w:val="dotted" w:sz="4" w:space="0" w:color="auto"/>
-          <w:insideH w:val="dotted" w:sz="4" w:space="0" w:color="auto"/>
-          <w:insideV w:val="dotted" w:sz="4" w:space="0" w:color="auto"/>
-        </w:tblBorders>
-        <w:tblLook w:val="04A0" w:firstRow="1" w:lastRow="0" w:firstColumn="1" w:lastColumn="0" w:noHBand="0" w:noVBand="1"/>
-      </w:tblPr>
-      <w:tblGrid>
-        <w:gridCol w:w="2181"/>
-        <w:gridCol w:w="6631"/>
-      </w:tblGrid>
-      <w:tr>
-        <w:tc>
-          <w:tcPr>
-            <w:tcW w:w="2235" w:type="dxa"/>
-            <w:shd w:val="clear" w:color="auto" w:fill="F2F2F2"/>
-          </w:tcPr>
-          <w:p>
-            <w:pPr>
-              <w:spacing w:after="120" w:line="276" w:lineRule="auto"/>
-              <w:rPr>
-                <w:rFonts w:ascii="Verdana" w:eastAsia="Times New Roman" w:hAnsi="Verdana" w:cs="Arial"/>
-                <w:b/>
-                <w:kern w:val="0"/>
-                <w:sz w:val="20"/>
-                <w:szCs w:val="20"/>
-                <w:lang w:val="en-US"/>
-                <w14:ligatures w14:val="none"/>
-              </w:rPr>
-            </w:pPr>
-            <w:proofErr w:type="spellStart"/>
-            <w:r>
-              <w:rPr>
-                <w:rFonts w:ascii="Verdana" w:eastAsia="Times New Roman" w:hAnsi="Verdana" w:cs="Arial"/>
-                <w:b/>
-                <w:kern w:val="0"/>
-                <w:sz w:val="20"/>
-                <w:szCs w:val="20"/>
-                <w:lang w:val="en-US"/>
-                <w14:ligatures w14:val="none"/>
-              </w:rPr>
-              <w:t>Időpont</w:t>
-            </w:r>
-            <w:proofErr w:type="spellEnd"/>
-            <w:r>
-              <w:rPr>
-                <w:rFonts w:ascii="Verdana" w:eastAsia="Times New Roman" w:hAnsi="Verdana" w:cs="Arial"/>
-                <w:b/>
-                <w:kern w:val="0"/>
-                <w:sz w:val="20"/>
-                <w:szCs w:val="20"/>
-                <w:lang w:val="en-US"/>
-                <w14:ligatures w14:val="none"/>
-              </w:rPr>
-              <w:t>:</w:t>
-            </w:r>
-          </w:p>
-        </w:tc>
-        <w:tc>
-          <w:tcPr>
-            <w:tcW w:w="7087" w:type="dxa"/>
-          </w:tcPr>
-          <w:p>
-            <w:pPr>
-              <w:spacing w:after="120" w:line="276" w:lineRule="auto"/>
-              <w:rPr>
-                <w:rFonts w:ascii="Verdana" w:eastAsia="Times New Roman" w:hAnsi="Verdana" w:cs="Arial"/>
-                <w:kern w:val="0"/>
-                <w:sz w:val="20"/>
-                <w:szCs w:val="20"/>
-                <w:lang w:val="en-US"/>
-                <w14:ligatures w14:val="none"/>
-              </w:rPr>
-            </w:pPr>
-          </w:p>
-        </w:tc>
-      </w:tr>
-      <w:tr>
-        <w:tc>
-          <w:tcPr>
-            <w:tcW w:w="2235" w:type="dxa"/>
-            <w:shd w:val="clear" w:color="auto" w:fill="F2F2F2"/>
-          </w:tcPr>
-          <w:p>
-            <w:pPr>
-              <w:spacing w:after="120" w:line="276" w:lineRule="auto"/>
-              <w:rPr>
-                <w:rFonts w:ascii="Verdana" w:eastAsia="Times New Roman" w:hAnsi="Verdana" w:cs="Arial"/>
-                <w:b/>
-                <w:kern w:val="0"/>
-                <w:sz w:val="20"/>
-                <w:szCs w:val="20"/>
-                <w:lang w:val="en-US"/>
-                <w14:ligatures w14:val="none"/>
-              </w:rPr>
-            </w:pPr>
-            <w:proofErr w:type="spellStart"/>
-            <w:r>
-              <w:rPr>
-                <w:rFonts w:ascii="Verdana" w:eastAsia="Times New Roman" w:hAnsi="Verdana" w:cs="Arial"/>
-                <w:b/>
-                <w:kern w:val="0"/>
-                <w:sz w:val="20"/>
-                <w:szCs w:val="20"/>
-                <w:lang w:val="en-US"/>
-                <w14:ligatures w14:val="none"/>
-              </w:rPr>
-              <w:t>Helyszín</w:t>
-            </w:r>
-            <w:proofErr w:type="spellEnd"/>
-            <w:r>
-              <w:rPr>
-                <w:rFonts w:ascii="Verdana" w:eastAsia="Times New Roman" w:hAnsi="Verdana" w:cs="Arial"/>
-                <w:b/>
-                <w:kern w:val="0"/>
-                <w:sz w:val="20"/>
-                <w:szCs w:val="20"/>
-                <w:lang w:val="en-US"/>
-                <w14:ligatures w14:val="none"/>
-              </w:rPr>
-              <w:t>:</w:t>
-            </w:r>
-          </w:p>
-        </w:tc>
-        <w:tc>
-          <w:tcPr>
-            <w:tcW w:w="7087" w:type="dxa"/>
-          </w:tcPr>
-          <w:p>
-            <w:pPr>
-              <w:spacing w:after="120" w:line="276" w:lineRule="auto"/>
-              <w:rPr>
-                <w:rFonts w:ascii="Verdana" w:eastAsia="Times New Roman" w:hAnsi="Verdana" w:cs="Arial"/>
-                <w:kern w:val="0"/>
-                <w:sz w:val="20"/>
-                <w:szCs w:val="20"/>
-                <w:lang w:val="en-US"/>
-                <w14:ligatures w14:val="none"/>
-              </w:rPr>
-            </w:pPr>
-          </w:p>
-        </w:tc>
-      </w:tr>
-      <w:tr>
-        <w:tc>
-          <w:tcPr>
-            <w:tcW w:w="2235" w:type="dxa"/>
-            <w:shd w:val="clear" w:color="auto" w:fill="F2F2F2"/>
-          </w:tcPr>
-          <w:p>
-            <w:pPr>
-              <w:spacing w:after="120" w:line="276" w:lineRule="auto"/>
-              <w:rPr>
-                <w:rFonts w:ascii="Verdana" w:eastAsia="Times New Roman" w:hAnsi="Verdana" w:cs="Arial"/>
-                <w:b/>
-                <w:kern w:val="0"/>
-                <w:sz w:val="20"/>
-                <w:szCs w:val="20"/>
-                <w:lang w:val="en-US"/>
-                <w14:ligatures w14:val="none"/>
-              </w:rPr>
-            </w:pPr>
-            <w:proofErr w:type="spellStart"/>
-            <w:r>
-              <w:rPr>
-                <w:rFonts w:ascii="Verdana" w:eastAsia="Times New Roman" w:hAnsi="Verdana" w:cs="Arial"/>
-                <w:b/>
-                <w:kern w:val="0"/>
-                <w:sz w:val="20"/>
-                <w:szCs w:val="20"/>
-                <w:lang w:val="en-US"/>
-                <w14:ligatures w14:val="none"/>
-              </w:rPr>
-              <w:t>Tárgy</w:t>
-            </w:r>
-            <w:proofErr w:type="spellEnd"/>
-            <w:r>
-              <w:rPr>
-                <w:rFonts w:ascii="Verdana" w:eastAsia="Times New Roman" w:hAnsi="Verdana" w:cs="Arial"/>
-                <w:b/>
-                <w:kern w:val="0"/>
-                <w:sz w:val="20"/>
-                <w:szCs w:val="20"/>
-                <w:lang w:val="en-US"/>
-                <w14:ligatures w14:val="none"/>
-              </w:rPr>
-              <w:t>:</w:t>
-            </w:r>
-          </w:p>
-        </w:tc>
-        <w:tc>
-          <w:tcPr>
-            <w:tcW w:w="7087" w:type="dxa"/>
-          </w:tcPr>
-          <w:p>
-            <w:pPr>
-              <w:spacing w:after="120" w:line="276" w:lineRule="auto"/>
-              <w:rPr>
-                <w:rFonts w:ascii="Verdana" w:eastAsia="Times New Roman" w:hAnsi="Verdana" w:cs="Arial"/>
-                <w:kern w:val="0"/>
-                <w:sz w:val="20"/>
-                <w:szCs w:val="20"/>
-                <w:lang w:val="en-US"/>
-                <w14:ligatures w14:val="none"/>
-              </w:rPr>
-            </w:pPr>
-          </w:p>
-        </w:tc>
-      </w:tr>
-      <w:tr>
-        <w:tc>
-          <w:tcPr>
-            <w:tcW w:w="2235" w:type="dxa"/>
-            <w:shd w:val="clear" w:color="auto" w:fill="F2F2F2"/>
-          </w:tcPr>
-          <w:p>
-            <w:pPr>
-              <w:spacing w:after="120" w:line="276" w:lineRule="auto"/>
-              <w:rPr>
-                <w:rFonts w:ascii="Verdana" w:eastAsia="Times New Roman" w:hAnsi="Verdana" w:cs="Arial"/>
-                <w:b/>
-                <w:kern w:val="0"/>
-                <w:sz w:val="20"/>
-                <w:szCs w:val="20"/>
-                <w:lang w:val="en-US"/>
-                <w14:ligatures w14:val="none"/>
-              </w:rPr>
-            </w:pPr>
-            <w:proofErr w:type="spellStart"/>
-            <w:r>
-              <w:rPr>
-                <w:rFonts w:ascii="Verdana" w:eastAsia="Times New Roman" w:hAnsi="Verdana" w:cs="Arial"/>
-                <w:b/>
-                <w:kern w:val="0"/>
-                <w:sz w:val="20"/>
-                <w:szCs w:val="20"/>
-                <w:lang w:val="en-US"/>
-                <w14:ligatures w14:val="none"/>
-              </w:rPr>
-              <w:t>Készítette</w:t>
-            </w:r>
-            <w:proofErr w:type="spellEnd"/>
-            <w:r>
-              <w:rPr>
-                <w:rFonts w:ascii="Verdana" w:eastAsia="Times New Roman" w:hAnsi="Verdana" w:cs="Arial"/>
-                <w:b/>
-                <w:kern w:val="0"/>
-                <w:sz w:val="20"/>
-                <w:szCs w:val="20"/>
-                <w:lang w:val="en-US"/>
-                <w14:ligatures w14:val="none"/>
-              </w:rPr>
-              <w:t>:</w:t>
-            </w:r>
-          </w:p>
-        </w:tc>
-        <w:tc>
-          <w:tcPr>
-            <w:tcW w:w="7087" w:type="dxa"/>
-          </w:tcPr>
-          <w:p>
-            <w:pPr>
-              <w:spacing w:after="120" w:line="276" w:lineRule="auto"/>
-              <w:rPr>
-                <w:rFonts w:ascii="Verdana" w:eastAsia="Times New Roman" w:hAnsi="Verdana" w:cs="Arial"/>
-                <w:kern w:val="0"/>
-                <w:sz w:val="20"/>
-                <w:szCs w:val="20"/>
-                <w:lang w:val="en-US"/>
-                <w14:ligatures w14:val="none"/>
-              </w:rPr>
-            </w:pPr>
-          </w:p>
-        </w:tc>
-      </w:tr>
-    </w:tbl>
-    <w:p>
-      <w:pPr>
-        <w:spacing w:after="200" w:line="276" w:lineRule="auto"/>
-        <w:rPr>
-          <w:rFonts w:ascii="Verdana" w:eastAsia="Times New Roman" w:hAnsi="Verdana" w:cs="Arial"/>
-          <w:kern w:val="0"/>
-          <w:sz w:val="20"/>
-          <w:szCs w:val="20"/>
-          <w:lang w:val="en-US"/>
-          <w14:ligatures w14:val="none"/>
-        </w:rPr>
-      </w:pPr>
-    </w:p>
-    <w:p>
-      <w:pPr>
-        <w:spacing w:after="200" w:line="276" w:lineRule="auto"/>
-        <w:rPr>
-          <w:rFonts w:ascii="Verdana" w:eastAsia="Times New Roman" w:hAnsi="Verdana" w:cs="Arial"/>
-          <w:b/>
-          <w:smallCaps/>
-          <w:kern w:val="0"/>
-          <w:sz w:val="20"/>
-          <w:szCs w:val="20"/>
-          <w:lang w:val="en-US"/>
-          <w14:ligatures w14:val="none"/>
-        </w:rPr>
-      </w:pPr>
-      <w:proofErr w:type="spellStart"/>
-      <w:r>
-        <w:rPr>
-          <w:rFonts w:ascii="Verdana" w:eastAsia="Times New Roman" w:hAnsi="Verdana" w:cs="Arial"/>
-          <w:b/>
-          <w:smallCaps/>
-          <w:kern w:val="0"/>
-          <w:sz w:val="20"/>
-          <w:szCs w:val="20"/>
-          <w:lang w:val="en-US"/>
-          <w14:ligatures w14:val="none"/>
-        </w:rPr>
-        <w:t>Résztvevők</w:t>
-      </w:r>
-      <w:proofErr w:type="spellEnd"/>
-      <w:r>
-        <w:rPr>
-          <w:rFonts w:ascii="Verdana" w:eastAsia="Times New Roman" w:hAnsi="Verdana" w:cs="Arial"/>
-          <w:b/>
-          <w:smallCaps/>
-          <w:kern w:val="0"/>
-          <w:sz w:val="20"/>
-          <w:szCs w:val="20"/>
-          <w:lang w:val="en-US"/>
-          <w14:ligatures w14:val="none"/>
-        </w:rPr>
-        <w:t>:</w:t>
-      </w:r>
-    </w:p>
-    <w:p>
-      <w:pPr>
-        <w:spacing w:after="200" w:line="276" w:lineRule="auto"/>
-        <w:rPr>
-          <w:rFonts w:ascii="Verdana" w:eastAsia="Times New Roman" w:hAnsi="Verdana" w:cs="Arial"/>
-          <w:b/>
-          <w:smallCaps/>
-          <w:kern w:val="0"/>
-          <w:sz w:val="20"/>
-          <w:szCs w:val="20"/>
-          <w:lang w:val="en-US"/>
-          <w14:ligatures w14:val="none"/>
-        </w:rPr>
-      </w:pPr>
-    </w:p>
-    <w:tbl>
-      <w:tblPr>
-        <w:tblW w:w="0" w:type="auto"/>
-        <w:tblInd w:w="250" w:type="dxa"/>
-        <w:tblBorders>
-          <w:top w:val="dotted" w:sz="4" w:space="0" w:color="auto"/>
-          <w:left w:val="dotted" w:sz="4" w:space="0" w:color="auto"/>
-          <w:bottom w:val="dotted" w:sz="4" w:space="0" w:color="auto"/>
-          <w:right w:val="dotted" w:sz="4" w:space="0" w:color="auto"/>
-          <w:insideH w:val="dotted" w:sz="4" w:space="0" w:color="auto"/>
-          <w:insideV w:val="dotted" w:sz="4" w:space="0" w:color="auto"/>
-        </w:tblBorders>
-        <w:tblLook w:val="04A0" w:firstRow="1" w:lastRow="0" w:firstColumn="1" w:lastColumn="0" w:noHBand="0" w:noVBand="1"/>
-      </w:tblPr>
-      <w:tblGrid>
-        <w:gridCol w:w="3388"/>
-        <w:gridCol w:w="2989"/>
-        <w:gridCol w:w="2435"/>
-      </w:tblGrid>
-      <w:tr>
-        <w:tc>
-          <w:tcPr>
-            <w:tcW w:w="3653" w:type="dxa"/>
-            <w:shd w:val="clear" w:color="auto" w:fill="F2F2F2"/>
-          </w:tcPr>
-          <w:p>
-            <w:pPr>
-              <w:spacing w:after="120" w:line="276" w:lineRule="auto"/>
-              <w:jc w:val="center"/>
-              <w:rPr>
-                <w:rFonts w:ascii="Verdana" w:eastAsia="Times New Roman" w:hAnsi="Verdana" w:cs="Arial"/>
-                <w:b/>
-                <w:kern w:val="0"/>
-                <w:sz w:val="20"/>
-                <w:szCs w:val="20"/>
-                <w:lang w:val="en-US"/>
-                <w14:ligatures w14:val="none"/>
-              </w:rPr>
-            </w:pPr>
-            <w:proofErr w:type="spellStart"/>
-            <w:r>
-              <w:rPr>
-                <w:rFonts w:ascii="Verdana" w:eastAsia="Times New Roman" w:hAnsi="Verdana" w:cs="Arial"/>
-                <w:b/>
-                <w:kern w:val="0"/>
-                <w:sz w:val="20"/>
-                <w:szCs w:val="20"/>
-                <w:lang w:val="en-US"/>
-                <w14:ligatures w14:val="none"/>
-              </w:rPr>
-              <w:t>Név</w:t>
-            </w:r>
-            <w:proofErr w:type="spellEnd"/>
-          </w:p>
-        </w:tc>
-        <w:tc>
-          <w:tcPr>
-            <w:tcW w:w="3151" w:type="dxa"/>
-            <w:shd w:val="clear" w:color="auto" w:fill="F2F2F2"/>
-          </w:tcPr>
-          <w:p>
-            <w:pPr>
-              <w:spacing w:after="120" w:line="276" w:lineRule="auto"/>
-              <w:jc w:val="center"/>
-              <w:rPr>
-                <w:rFonts w:ascii="Verdana" w:eastAsia="Times New Roman" w:hAnsi="Verdana" w:cs="Arial"/>
-                <w:b/>
-                <w:kern w:val="0"/>
-                <w:sz w:val="20"/>
-                <w:szCs w:val="20"/>
-                <w:lang w:val="en-US"/>
-                <w14:ligatures w14:val="none"/>
-              </w:rPr>
-            </w:pPr>
-            <w:proofErr w:type="spellStart"/>
-            <w:r>
-              <w:rPr>
-                <w:rFonts w:ascii="Verdana" w:eastAsia="Times New Roman" w:hAnsi="Verdana" w:cs="Arial"/>
-                <w:b/>
-                <w:kern w:val="0"/>
-                <w:sz w:val="20"/>
-                <w:szCs w:val="20"/>
-                <w:lang w:val="en-US"/>
-                <w14:ligatures w14:val="none"/>
-              </w:rPr>
-              <w:t>Szervezet</w:t>
-            </w:r>
-            <w:proofErr w:type="spellEnd"/>
-          </w:p>
-        </w:tc>
-        <w:tc>
-          <w:tcPr>
-            <w:tcW w:w="2552" w:type="dxa"/>
-            <w:shd w:val="clear" w:color="auto" w:fill="F2F2F2"/>
-          </w:tcPr>
-          <w:p>
-            <w:pPr>
-              <w:spacing w:after="120" w:line="276" w:lineRule="auto"/>
-              <w:jc w:val="center"/>
-              <w:rPr>
-                <w:rFonts w:ascii="Verdana" w:eastAsia="Times New Roman" w:hAnsi="Verdana" w:cs="Arial"/>
-                <w:b/>
-                <w:kern w:val="0"/>
-                <w:sz w:val="20"/>
-                <w:szCs w:val="20"/>
-                <w:lang w:val="en-US"/>
-                <w14:ligatures w14:val="none"/>
-              </w:rPr>
-            </w:pPr>
-            <w:proofErr w:type="spellStart"/>
-            <w:r>
-              <w:rPr>
-                <w:rFonts w:ascii="Verdana" w:eastAsia="Times New Roman" w:hAnsi="Verdana" w:cs="Arial"/>
-                <w:b/>
-                <w:kern w:val="0"/>
-                <w:sz w:val="20"/>
-                <w:szCs w:val="20"/>
-                <w:lang w:val="en-US"/>
-                <w14:ligatures w14:val="none"/>
-              </w:rPr>
-              <w:t>Beosztás</w:t>
-            </w:r>
-            <w:proofErr w:type="spellEnd"/>
-          </w:p>
-        </w:tc>
-      </w:tr>
-      <w:tr>
-        <w:tc>
-          <w:tcPr>
-            <w:tcW w:w="3653" w:type="dxa"/>
-            <w:vAlign w:val="center"/>
-          </w:tcPr>
-          <w:p>
-            <w:pPr>
-              <w:spacing w:before="60" w:after="60" w:line="276" w:lineRule="auto"/>
-              <w:rPr>
-                <w:rFonts w:ascii="Verdana" w:eastAsia="Times New Roman" w:hAnsi="Verdana" w:cs="Arial"/>
-                <w:kern w:val="0"/>
-                <w:sz w:val="20"/>
-                <w:szCs w:val="20"/>
-                <w:lang w:val="en-US"/>
-                <w14:ligatures w14:val="none"/>
-              </w:rPr>
-            </w:pPr>
-          </w:p>
-        </w:tc>
-        <w:tc>
-          <w:tcPr>
-            <w:tcW w:w="3151" w:type="dxa"/>
-            <w:vAlign w:val="center"/>
-          </w:tcPr>
-          <w:p>
-            <w:pPr>
-              <w:spacing w:before="60" w:after="60" w:line="276" w:lineRule="auto"/>
-              <w:rPr>
-                <w:rFonts w:ascii="Verdana" w:eastAsia="Times New Roman" w:hAnsi="Verdana" w:cs="Arial"/>
-                <w:kern w:val="0"/>
-                <w:sz w:val="20"/>
-                <w:szCs w:val="20"/>
-                <w:lang w:val="en-US"/>
-                <w14:ligatures w14:val="none"/>
-              </w:rPr>
-            </w:pPr>
-          </w:p>
-        </w:tc>
-        <w:tc>
-          <w:tcPr>
-            <w:tcW w:w="2552" w:type="dxa"/>
-            <w:vAlign w:val="center"/>
-          </w:tcPr>
-          <w:p>
-            <w:pPr>
-              <w:spacing w:before="60" w:after="60" w:line="276" w:lineRule="auto"/>
-              <w:rPr>
-                <w:rFonts w:ascii="Verdana" w:eastAsia="Times New Roman" w:hAnsi="Verdana" w:cs="Arial"/>
-                <w:kern w:val="0"/>
-                <w:sz w:val="20"/>
-                <w:szCs w:val="20"/>
-                <w:lang w:val="en-US"/>
-                <w14:ligatures w14:val="none"/>
-              </w:rPr>
-            </w:pPr>
-          </w:p>
-        </w:tc>
-      </w:tr>
-      <w:tr>
-        <w:tc>
-          <w:tcPr>
-            <w:tcW w:w="3653" w:type="dxa"/>
-            <w:vAlign w:val="center"/>
-          </w:tcPr>
-          <w:p>
-            <w:pPr>
-              <w:spacing w:before="60" w:after="60" w:line="276" w:lineRule="auto"/>
-              <w:rPr>
-                <w:rFonts w:ascii="Verdana" w:eastAsia="Times New Roman" w:hAnsi="Verdana" w:cs="Arial"/>
-                <w:kern w:val="0"/>
-                <w:sz w:val="20"/>
-                <w:szCs w:val="20"/>
-                <w:lang w:val="en-US"/>
-                <w14:ligatures w14:val="none"/>
-              </w:rPr>
-            </w:pPr>
-          </w:p>
-        </w:tc>
-        <w:tc>
-          <w:tcPr>
-            <w:tcW w:w="3151" w:type="dxa"/>
-            <w:vAlign w:val="center"/>
-          </w:tcPr>
-          <w:p>
-            <w:pPr>
-              <w:spacing w:before="60" w:after="60" w:line="276" w:lineRule="auto"/>
-              <w:rPr>
-                <w:rFonts w:ascii="Verdana" w:eastAsia="Times New Roman" w:hAnsi="Verdana" w:cs="Arial"/>
-                <w:kern w:val="0"/>
-                <w:sz w:val="20"/>
-                <w:szCs w:val="20"/>
-                <w:lang w:val="en-US"/>
-                <w14:ligatures w14:val="none"/>
-              </w:rPr>
-            </w:pPr>
-          </w:p>
-        </w:tc>
-        <w:tc>
-          <w:tcPr>
-            <w:tcW w:w="2552" w:type="dxa"/>
-            <w:vAlign w:val="center"/>
-          </w:tcPr>
-          <w:p>
-            <w:pPr>
-              <w:spacing w:before="60" w:after="60" w:line="276" w:lineRule="auto"/>
-              <w:rPr>
-                <w:rFonts w:ascii="Verdana" w:eastAsia="Times New Roman" w:hAnsi="Verdana" w:cs="Arial"/>
-                <w:kern w:val="0"/>
-                <w:sz w:val="20"/>
-                <w:szCs w:val="20"/>
-                <w:lang w:val="en-US"/>
-                <w14:ligatures w14:val="none"/>
-              </w:rPr>
-            </w:pPr>
-          </w:p>
-        </w:tc>
-      </w:tr>
-      <w:tr>
-        <w:tc>
-          <w:tcPr>
-            <w:tcW w:w="3653" w:type="dxa"/>
-            <w:vAlign w:val="center"/>
-          </w:tcPr>
-          <w:p>
-            <w:pPr>
-              <w:spacing w:before="60" w:after="60" w:line="276" w:lineRule="auto"/>
-              <w:rPr>
-                <w:rFonts w:ascii="Verdana" w:eastAsia="Times New Roman" w:hAnsi="Verdana" w:cs="Arial"/>
-                <w:kern w:val="0"/>
-                <w:sz w:val="20"/>
-                <w:szCs w:val="20"/>
-                <w:lang w:val="en-US"/>
-                <w14:ligatures w14:val="none"/>
-              </w:rPr>
-            </w:pPr>
-          </w:p>
-        </w:tc>
-        <w:tc>
-          <w:tcPr>
-            <w:tcW w:w="3151" w:type="dxa"/>
-            <w:vAlign w:val="center"/>
-          </w:tcPr>
-          <w:p>
-            <w:pPr>
-              <w:spacing w:before="60" w:after="60" w:line="276" w:lineRule="auto"/>
-              <w:rPr>
-                <w:rFonts w:ascii="Verdana" w:eastAsia="Times New Roman" w:hAnsi="Verdana" w:cs="Arial"/>
-                <w:kern w:val="0"/>
-                <w:sz w:val="20"/>
-                <w:szCs w:val="20"/>
-                <w:lang w:val="en-US"/>
-                <w14:ligatures w14:val="none"/>
-              </w:rPr>
-            </w:pPr>
-          </w:p>
-        </w:tc>
-        <w:tc>
-          <w:tcPr>
-            <w:tcW w:w="2552" w:type="dxa"/>
-            <w:vAlign w:val="center"/>
-          </w:tcPr>
-          <w:p>
-            <w:pPr>
-              <w:spacing w:before="60" w:after="60" w:line="276" w:lineRule="auto"/>
-              <w:rPr>
-                <w:rFonts w:ascii="Verdana" w:eastAsia="Times New Roman" w:hAnsi="Verdana" w:cs="Arial"/>
-                <w:kern w:val="0"/>
-                <w:sz w:val="20"/>
-                <w:szCs w:val="20"/>
-                <w:lang w:val="en-US"/>
-                <w14:ligatures w14:val="none"/>
-              </w:rPr>
-            </w:pPr>
-          </w:p>
-        </w:tc>
-      </w:tr>
-      <w:tr>
-        <w:tc>
-          <w:tcPr>
-            <w:tcW w:w="3653" w:type="dxa"/>
-            <w:vAlign w:val="center"/>
-          </w:tcPr>
-          <w:p>
-            <w:pPr>
-              <w:spacing w:before="60" w:after="60" w:line="276" w:lineRule="auto"/>
-              <w:rPr>
-                <w:rFonts w:ascii="Verdana" w:eastAsia="Times New Roman" w:hAnsi="Verdana" w:cs="Arial"/>
-                <w:kern w:val="0"/>
-                <w:sz w:val="20"/>
-                <w:szCs w:val="20"/>
-                <w:lang w:val="en-US"/>
-                <w14:ligatures w14:val="none"/>
-              </w:rPr>
-            </w:pPr>
-          </w:p>
-        </w:tc>
-        <w:tc>
-          <w:tcPr>
-            <w:tcW w:w="3151" w:type="dxa"/>
-            <w:vAlign w:val="center"/>
-          </w:tcPr>
-          <w:p>
-            <w:pPr>
-              <w:spacing w:before="60" w:after="60" w:line="276" w:lineRule="auto"/>
-              <w:rPr>
-                <w:rFonts w:ascii="Verdana" w:eastAsia="Times New Roman" w:hAnsi="Verdana" w:cs="Arial"/>
-                <w:kern w:val="0"/>
-                <w:sz w:val="20"/>
-                <w:szCs w:val="20"/>
-                <w:lang w:val="en-US"/>
-                <w14:ligatures w14:val="none"/>
-              </w:rPr>
-            </w:pPr>
-          </w:p>
-        </w:tc>
-        <w:tc>
-          <w:tcPr>
-            <w:tcW w:w="2552" w:type="dxa"/>
-            <w:vAlign w:val="center"/>
-          </w:tcPr>
-          <w:p>
-            <w:pPr>
-              <w:spacing w:before="60" w:after="60" w:line="276" w:lineRule="auto"/>
-              <w:rPr>
-                <w:rFonts w:ascii="Verdana" w:eastAsia="Times New Roman" w:hAnsi="Verdana" w:cs="Arial"/>
-                <w:kern w:val="0"/>
-                <w:sz w:val="20"/>
-                <w:szCs w:val="20"/>
-                <w:lang w:val="en-US"/>
-                <w14:ligatures w14:val="none"/>
-              </w:rPr>
-            </w:pPr>
-          </w:p>
-        </w:tc>
-      </w:tr>
-      <w:tr>
-        <w:tc>
-          <w:tcPr>
-            <w:tcW w:w="3653" w:type="dxa"/>
-            <w:vAlign w:val="center"/>
-          </w:tcPr>
-          <w:p>
-            <w:pPr>
-              <w:spacing w:before="60" w:after="60" w:line="276" w:lineRule="auto"/>
-              <w:rPr>
-                <w:rFonts w:ascii="Verdana" w:eastAsia="Times New Roman" w:hAnsi="Verdana" w:cs="Arial"/>
-                <w:kern w:val="0"/>
-                <w:sz w:val="20"/>
-                <w:szCs w:val="20"/>
-                <w:lang w:val="en-US"/>
-                <w14:ligatures w14:val="none"/>
-              </w:rPr>
-            </w:pPr>
-          </w:p>
-        </w:tc>
-        <w:tc>
-          <w:tcPr>
-            <w:tcW w:w="3151" w:type="dxa"/>
-            <w:vAlign w:val="center"/>
-          </w:tcPr>
-          <w:p>
-            <w:pPr>
-              <w:spacing w:before="60" w:after="60" w:line="276" w:lineRule="auto"/>
-              <w:rPr>
-                <w:rFonts w:ascii="Verdana" w:eastAsia="Times New Roman" w:hAnsi="Verdana" w:cs="Arial"/>
-                <w:kern w:val="0"/>
-                <w:sz w:val="20"/>
-                <w:szCs w:val="20"/>
-                <w:lang w:val="en-US"/>
-                <w14:ligatures w14:val="none"/>
-              </w:rPr>
-            </w:pPr>
-          </w:p>
-        </w:tc>
-        <w:tc>
-          <w:tcPr>
-            <w:tcW w:w="2552" w:type="dxa"/>
-            <w:vAlign w:val="center"/>
-          </w:tcPr>
-          <w:p>
-            <w:pPr>
-              <w:spacing w:before="60" w:after="60" w:line="276" w:lineRule="auto"/>
-              <w:rPr>
-                <w:rFonts w:ascii="Verdana" w:eastAsia="Times New Roman" w:hAnsi="Verdana" w:cs="Arial"/>
-                <w:kern w:val="0"/>
-                <w:sz w:val="20"/>
-                <w:szCs w:val="20"/>
-                <w:lang w:val="en-US"/>
-                <w14:ligatures w14:val="none"/>
-              </w:rPr>
-            </w:pPr>
-          </w:p>
-        </w:tc>
-      </w:tr>
-    </w:tbl>
-    <w:p>
-      <w:pPr>
-        <w:spacing w:after="200" w:line="240" w:lineRule="auto"/>
-        <w:jc w:val="both"/>
-        <w:rPr>
-          <w:rFonts w:ascii="Verdana" w:eastAsia="Times New Roman" w:hAnsi="Verdana" w:cs="Arial"/>
-          <w:kern w:val="0"/>
-          <w:sz w:val="20"/>
-          <w:szCs w:val="20"/>
-          <w:lang w:eastAsia="hu-HU"/>
-          <w14:ligatures w14:val="none"/>
-        </w:rPr>
-      </w:pPr>
-    </w:p>
-    <w:p>
-      <w:r>
-        <w:rPr>
-          <w:rFonts w:ascii="Verdana" w:eastAsia="Times New Roman" w:hAnsi="Verdana" w:cs="Arial"/>
-          <w:kern w:val="0"/>
-          <w:szCs w:val="24"/>
-          <w:lang w:val="en-US"/>
-          <w14:ligatures w14:val="none"/>
-        </w:rPr>
-        <w:t xml:space="preserve">A </w:t>
-      </w:r>
-      <w:proofErr w:type="spellStart"/>
-      <w:r>
-        <w:rPr>
-          <w:rFonts w:ascii="Verdana" w:eastAsia="Times New Roman" w:hAnsi="Verdana" w:cs="Arial"/>
-          <w:kern w:val="0"/>
-          <w:szCs w:val="24"/>
-          <w:lang w:val="en-US"/>
-          <w14:ligatures w14:val="none"/>
-        </w:rPr>
-        <w:t>megbeszélésen</w:t>
-      </w:r>
-      <w:proofErr w:type="spellEnd"/>
-      <w:r>
-        <w:rPr>
-          <w:rFonts w:ascii="Verdana" w:eastAsia="Times New Roman" w:hAnsi="Verdana" w:cs="Arial"/>
-          <w:kern w:val="0"/>
-          <w:szCs w:val="24"/>
-          <w:lang w:val="en-US"/>
-          <w14:ligatures w14:val="none"/>
-        </w:rPr>
-        <w:t xml:space="preserve"> </w:t>
-      </w:r>
-      <w:proofErr w:type="spellStart"/>
-      <w:r>
-        <w:rPr>
-          <w:rFonts w:ascii="Verdana" w:eastAsia="Times New Roman" w:hAnsi="Verdana" w:cs="Arial"/>
-          <w:kern w:val="0"/>
-          <w:szCs w:val="24"/>
-          <w:lang w:val="en-US"/>
-          <w14:ligatures w14:val="none"/>
-        </w:rPr>
-        <w:t>elhangzottak</w:t>
-      </w:r>
-      <w:proofErr w:type="spellEnd"/>
-      <w:r>
-        <w:rPr>
-          <w:rFonts w:ascii="Verdana" w:eastAsia="Times New Roman" w:hAnsi="Verdana" w:cs="Arial"/>
-          <w:kern w:val="0"/>
-          <w:szCs w:val="24"/>
-          <w:lang w:val="en-US"/>
-          <w14:ligatures w14:val="none"/>
-        </w:rPr>
-        <w:t xml:space="preserve"> </w:t>
-      </w:r>
-      <w:proofErr w:type="spellStart"/>
-      <w:r>
-        <w:rPr>
-          <w:rFonts w:ascii="Verdana" w:eastAsia="Times New Roman" w:hAnsi="Verdana" w:cs="Arial"/>
-          <w:kern w:val="0"/>
-          <w:szCs w:val="24"/>
-          <w:lang w:val="en-US"/>
-          <w14:ligatures w14:val="none"/>
-        </w:rPr>
-        <w:t>összegzése</w:t>
-      </w:r>
-      <w:proofErr w:type="spellEnd"/>
     </w:p>
     <w:sectPr>
-      <w:pgSz w:w="11906" w:h="16838"/>
-      <w:pgMar w:top="1417" w:right="1417" w:bottom="1417" w:left="1417" w:header="708" w:footer="708" w:gutter="0"/>
+      <w:pgSz w:w="11907" w:h="16840" w:code="9"/>
+      <w:pgMar w:top="1440" w:right="1797" w:bottom="1440" w:left="1797" w:header="709" w:footer="709" w:gutter="0"/>
       <w:cols w:space="708"/>
+      <w:titlePg/>
       <w:docGrid w:linePitch="360"/>
     </w:sectPr>
   </w:body>
@@ -5605,6 +3582,119 @@
       </w:pPr>
     </w:lvl>
   </w:abstractNum>
+  <w:abstractNum w:abstractNumId="4" w15:restartNumberingAfterBreak="0">
+    <w:nsid w:val="77096C16"/>
+    <w:multiLevelType w:val="hybridMultilevel"/>
+    <w:tmpl w:val="BB6EF888"/>
+    <w:lvl w:ilvl="0" w:tplc="040E0001">
+      <w:start w:val="1"/>
+      <w:numFmt w:val="bullet"/>
+      <w:lvlText w:val=""/>
+      <w:lvlJc w:val="left"/>
+      <w:pPr>
+        <w:ind w:left="720" w:hanging="360"/>
+      </w:pPr>
+      <w:rPr>
+        <w:rFonts w:ascii="Symbol" w:hAnsi="Symbol" w:hint="default"/>
+      </w:rPr>
+    </w:lvl>
+    <w:lvl w:ilvl="1" w:tplc="040E0003" w:tentative="1">
+      <w:start w:val="1"/>
+      <w:numFmt w:val="bullet"/>
+      <w:lvlText w:val="o"/>
+      <w:lvlJc w:val="left"/>
+      <w:pPr>
+        <w:ind w:left="1440" w:hanging="360"/>
+      </w:pPr>
+      <w:rPr>
+        <w:rFonts w:ascii="Courier New" w:hAnsi="Courier New" w:cs="Courier New" w:hint="default"/>
+      </w:rPr>
+    </w:lvl>
+    <w:lvl w:ilvl="2" w:tplc="040E0005" w:tentative="1">
+      <w:start w:val="1"/>
+      <w:numFmt w:val="bullet"/>
+      <w:lvlText w:val=""/>
+      <w:lvlJc w:val="left"/>
+      <w:pPr>
+        <w:ind w:left="2160" w:hanging="360"/>
+      </w:pPr>
+      <w:rPr>
+        <w:rFonts w:ascii="Wingdings" w:hAnsi="Wingdings" w:hint="default"/>
+      </w:rPr>
+    </w:lvl>
+    <w:lvl w:ilvl="3" w:tplc="040E0001" w:tentative="1">
+      <w:start w:val="1"/>
+      <w:numFmt w:val="bullet"/>
+      <w:lvlText w:val=""/>
+      <w:lvlJc w:val="left"/>
+      <w:pPr>
+        <w:ind w:left="2880" w:hanging="360"/>
+      </w:pPr>
+      <w:rPr>
+        <w:rFonts w:ascii="Symbol" w:hAnsi="Symbol" w:hint="default"/>
+      </w:rPr>
+    </w:lvl>
+    <w:lvl w:ilvl="4" w:tplc="040E0003" w:tentative="1">
+      <w:start w:val="1"/>
+      <w:numFmt w:val="bullet"/>
+      <w:lvlText w:val="o"/>
+      <w:lvlJc w:val="left"/>
+      <w:pPr>
+        <w:ind w:left="3600" w:hanging="360"/>
+      </w:pPr>
+      <w:rPr>
+        <w:rFonts w:ascii="Courier New" w:hAnsi="Courier New" w:cs="Courier New" w:hint="default"/>
+      </w:rPr>
+    </w:lvl>
+    <w:lvl w:ilvl="5" w:tplc="040E0005" w:tentative="1">
+      <w:start w:val="1"/>
+      <w:numFmt w:val="bullet"/>
+      <w:lvlText w:val=""/>
+      <w:lvlJc w:val="left"/>
+      <w:pPr>
+        <w:ind w:left="4320" w:hanging="360"/>
+      </w:pPr>
+      <w:rPr>
+        <w:rFonts w:ascii="Wingdings" w:hAnsi="Wingdings" w:hint="default"/>
+      </w:rPr>
+    </w:lvl>
+    <w:lvl w:ilvl="6" w:tplc="040E0001" w:tentative="1">
+      <w:start w:val="1"/>
+      <w:numFmt w:val="bullet"/>
+      <w:lvlText w:val=""/>
+      <w:lvlJc w:val="left"/>
+      <w:pPr>
+        <w:ind w:left="5040" w:hanging="360"/>
+      </w:pPr>
+      <w:rPr>
+        <w:rFonts w:ascii="Symbol" w:hAnsi="Symbol" w:hint="default"/>
+      </w:rPr>
+    </w:lvl>
+    <w:lvl w:ilvl="7" w:tplc="040E0003" w:tentative="1">
+      <w:start w:val="1"/>
+      <w:numFmt w:val="bullet"/>
+      <w:lvlText w:val="o"/>
+      <w:lvlJc w:val="left"/>
+      <w:pPr>
+        <w:ind w:left="5760" w:hanging="360"/>
+      </w:pPr>
+      <w:rPr>
+        <w:rFonts w:ascii="Courier New" w:hAnsi="Courier New" w:cs="Courier New" w:hint="default"/>
+      </w:rPr>
+    </w:lvl>
+    <w:lvl w:ilvl="8" w:tplc="040E0005" w:tentative="1">
+      <w:start w:val="1"/>
+      <w:numFmt w:val="bullet"/>
+      <w:lvlText w:val=""/>
+      <w:lvlJc w:val="left"/>
+      <w:pPr>
+        <w:ind w:left="6480" w:hanging="360"/>
+      </w:pPr>
+      <w:rPr>
+        <w:rFonts w:ascii="Wingdings" w:hAnsi="Wingdings" w:hint="default"/>
+      </w:rPr>
+    </w:lvl>
+  </w:abstractNum>
   <w:num w:numId="1" w16cid:durableId="991373952">
     <w:abstractNumId w:val="1"/>
   </w:num>
@@ -5616,6 +3706,9 @@
   </w:num>
   <w:num w:numId="4" w16cid:durableId="2015109926">
     <w:abstractNumId w:val="0"/>
+  </w:num>
+  <w:num w:numId="5" w16cid:durableId="1352682490">
+    <w:abstractNumId w:val="4"/>
   </w:num>
 </w:numbering>
 </file>
@@ -6228,7 +4321,6 @@
   <w:style w:type="character" w:default="1" w:styleId="Bekezdsalapbettpusa">
     <w:name w:val="Default Paragraph Font"/>
     <w:uiPriority w:val="1"/>
-    <w:semiHidden/>
     <w:unhideWhenUsed/>
   </w:style>
   <w:style w:type="table" w:default="1" w:styleId="Normltblzat">
@@ -6557,7 +4649,6 @@
     <w:basedOn w:val="Norml"/>
     <w:link w:val="llbChar"/>
     <w:uiPriority w:val="99"/>
-    <w:semiHidden/>
     <w:unhideWhenUsed/>
     <w:rsid w:val="00085E52"/>
     <w:pPr>
@@ -6573,7 +4664,6 @@
     <w:basedOn w:val="Bekezdsalapbettpusa"/>
     <w:link w:val="llb"/>
     <w:uiPriority w:val="99"/>
-    <w:semiHidden/>
     <w:rsid w:val="00085E52"/>
     <w:rPr>
       <w:rFonts w:ascii="Times New Roman" w:hAnsi="Times New Roman"/>
@@ -6585,7 +4675,6 @@
     <w:basedOn w:val="Norml"/>
     <w:link w:val="lfejChar"/>
     <w:uiPriority w:val="99"/>
-    <w:semiHidden/>
     <w:unhideWhenUsed/>
     <w:rsid w:val="00085E52"/>
     <w:pPr>
@@ -6601,7 +4690,6 @@
     <w:basedOn w:val="Bekezdsalapbettpusa"/>
     <w:link w:val="lfej"/>
     <w:uiPriority w:val="99"/>
-    <w:semiHidden/>
     <w:rsid w:val="00085E52"/>
     <w:rPr>
       <w:rFonts w:ascii="Times New Roman" w:hAnsi="Times New Roman"/>
@@ -6704,6 +4792,30 @@
     <w:rsid w:val="004624F2"/>
     <w:rPr>
       <w:color w:val="0563C1" w:themeColor="hyperlink"/>
+      <w:u w:val="single"/>
+    </w:rPr>
+  </w:style>
+  <w:style w:type="character" w:styleId="Feloldatlanmegemlts">
+    <w:name w:val="Unresolved Mention"/>
+    <w:basedOn w:val="Bekezdsalapbettpusa"/>
+    <w:uiPriority w:val="99"/>
+    <w:semiHidden/>
+    <w:unhideWhenUsed/>
+    <w:rsid w:val="005C4D6F"/>
+    <w:rPr>
+      <w:color w:val="605E5C"/>
+      <w:shd w:val="clear" w:color="auto" w:fill="E1DFDD"/>
+    </w:rPr>
+  </w:style>
+  <w:style w:type="character" w:styleId="Mrltotthiperhivatkozs">
+    <w:name w:val="FollowedHyperlink"/>
+    <w:basedOn w:val="Bekezdsalapbettpusa"/>
+    <w:uiPriority w:val="99"/>
+    <w:semiHidden/>
+    <w:unhideWhenUsed/>
+    <w:rsid w:val="003B6386"/>
+    <w:rPr>
+      <w:color w:val="954F72" w:themeColor="followedHyperlink"/>
       <w:u w:val="single"/>
     </w:rPr>
   </w:style>

</xml_diff>